<commit_message>
Update Adam Report - complete the ADAM part
</commit_message>
<xml_diff>
--- a/report/Midterm_Report_Adam_Section.docx
+++ b/report/Midterm_Report_Adam_Section.docx
@@ -49,7 +49,7 @@
           <w:left w:w="10" w:type="dxa"/>
           <w:right w:w="10" w:type="dxa"/>
         </w:tblCellMar>
-        <w:tblLook w:val="04A0" w:firstRow="1" w:lastRow="0" w:firstColumn="1" w:lastColumn="0" w:noHBand="0" w:noVBand="1"/>
+        <w:tblLook w:val="0000" w:firstRow="0" w:lastRow="0" w:firstColumn="0" w:lastColumn="0" w:noHBand="0" w:noVBand="0"/>
       </w:tblPr>
       <w:tblGrid>
         <w:gridCol w:w="4891"/>
@@ -424,6 +424,17 @@
     </w:p>
     <w:p>
       <w:pPr>
+        <w:pStyle w:val="MdParagraph"/>
+      </w:pPr>
+      <w:r>
+        <w:rPr>
+          <w:rStyle w:val="MdEm"/>
+        </w:rPr>
+        <w:t>[To be completed by Andy / Pessoa 5]</w:t>
+      </w:r>
+    </w:p>
+    <w:p>
+      <w:pPr>
         <w:pStyle w:val="MdSpace"/>
         <w:spacing w:after="60"/>
       </w:pPr>
@@ -452,6 +463,17 @@
     </w:p>
     <w:p>
       <w:pPr>
+        <w:pStyle w:val="MdParagraph"/>
+      </w:pPr>
+      <w:r>
+        <w:rPr>
+          <w:rStyle w:val="MdEm"/>
+        </w:rPr>
+        <w:t>[To be completed by Pessoa 1]</w:t>
+      </w:r>
+    </w:p>
+    <w:p>
+      <w:pPr>
         <w:pStyle w:val="MdSpace"/>
         <w:spacing w:after="60"/>
       </w:pPr>
@@ -475,6 +497,7 @@
         <w:pStyle w:val="MdHeading2"/>
       </w:pPr>
       <w:r>
+        <w:lastRenderedPageBreak/>
         <w:t>3. Optimizer Descriptions and Theoretical Background</w:t>
       </w:r>
     </w:p>
@@ -491,11 +514,23 @@
         <w:pStyle w:val="MdParagraph"/>
       </w:pPr>
       <w:r>
-        <w:t xml:space="preserve">Adam (Adaptive Moment Estimation) is an optimization algorithm introduced by Kingma &amp; Ba (2015) that computes adaptive learning rates for each parameter. It combines the advantages of two other well-known extensions of stochastic gradient descent: momentum </w:t>
-      </w:r>
-      <w:r>
-        <w:lastRenderedPageBreak/>
-        <w:t>and RMSprop. Specifically, Adam maintains an exponentially decaying average of past gradients (the first moment, similar to momentum) and an exponentially decaying average of past squared gradients (the second moment, similar to RMSprop).</w:t>
+        <w:t xml:space="preserve">Adam (Adaptive Moment Estimation) is an optimization algorithm introduced by Kingma &amp; Ba (2015) that computes adaptive learning rates for each parameter. It combines the advantages of two other well-known extensions of stochastic gradient descent: momentum and RMSprop. Specifically, Adam maintains an exponentially decaying average of past gradients (the first moment, </w:t>
+      </w:r>
+      <w:proofErr w:type="gramStart"/>
+      <w:r>
+        <w:t>similar to</w:t>
+      </w:r>
+      <w:proofErr w:type="gramEnd"/>
+      <w:r>
+        <w:t xml:space="preserve"> momentum) and an exponentially decaying average of past squared gradients (the second moment, </w:t>
+      </w:r>
+      <w:proofErr w:type="gramStart"/>
+      <w:r>
+        <w:t>similar to</w:t>
+      </w:r>
+      <w:proofErr w:type="gramEnd"/>
+      <w:r>
+        <w:t xml:space="preserve"> RMSprop).</w:t>
       </w:r>
     </w:p>
     <w:p>
@@ -564,6 +599,17 @@
     </w:p>
     <w:p>
       <w:pPr>
+        <w:pStyle w:val="MdParagraph"/>
+      </w:pPr>
+      <w:r>
+        <w:rPr>
+          <w:rStyle w:val="MdEm"/>
+        </w:rPr>
+        <w:t>[To be completed by Kevin]</w:t>
+      </w:r>
+    </w:p>
+    <w:p>
+      <w:pPr>
         <w:pStyle w:val="MdSpace"/>
         <w:spacing w:after="60"/>
       </w:pPr>
@@ -574,6 +620,17 @@
       </w:pPr>
       <w:r>
         <w:t>3.3 AdamW (Adam with Decoupled Weight Decay)</w:t>
+      </w:r>
+    </w:p>
+    <w:p>
+      <w:pPr>
+        <w:pStyle w:val="MdParagraph"/>
+      </w:pPr>
+      <w:r>
+        <w:rPr>
+          <w:rStyle w:val="MdEm"/>
+        </w:rPr>
+        <w:t>[To be completed by Pessoa 4]</w:t>
       </w:r>
     </w:p>
     <w:p>
@@ -686,6 +743,17 @@
     </w:p>
     <w:p>
       <w:pPr>
+        <w:pStyle w:val="MdParagraph"/>
+      </w:pPr>
+      <w:r>
+        <w:rPr>
+          <w:rStyle w:val="MdEm"/>
+        </w:rPr>
+        <w:t>[To be completed by Pessoa 1]</w:t>
+      </w:r>
+    </w:p>
+    <w:p>
+      <w:pPr>
         <w:pStyle w:val="MdSpace"/>
         <w:spacing w:after="60"/>
       </w:pPr>
@@ -696,6 +764,17 @@
       </w:pPr>
       <w:r>
         <w:t>4.3 Training Setup</w:t>
+      </w:r>
+    </w:p>
+    <w:p>
+      <w:pPr>
+        <w:pStyle w:val="MdParagraph"/>
+      </w:pPr>
+      <w:r>
+        <w:rPr>
+          <w:rStyle w:val="MdEm"/>
+        </w:rPr>
+        <w:t>[To be completed by Pessoa 1]</w:t>
       </w:r>
     </w:p>
     <w:p>
@@ -723,7 +802,6 @@
         <w:pStyle w:val="MdHeading2"/>
       </w:pPr>
       <w:r>
-        <w:lastRenderedPageBreak/>
         <w:t>5. Results</w:t>
       </w:r>
     </w:p>
@@ -733,6 +811,17 @@
       </w:pPr>
       <w:r>
         <w:t>5.1 Summary Table</w:t>
+      </w:r>
+    </w:p>
+    <w:p>
+      <w:pPr>
+        <w:pStyle w:val="MdParagraph"/>
+      </w:pPr>
+      <w:r>
+        <w:rPr>
+          <w:rStyle w:val="MdEm"/>
+        </w:rPr>
+        <w:t>[To be completed by Pessoa 5 — combining all three optimizers]</w:t>
       </w:r>
     </w:p>
     <w:p>
@@ -743,10 +832,1152 @@
     </w:p>
     <w:p>
       <w:pPr>
+        <w:pStyle w:val="MdParagraph"/>
+      </w:pPr>
+      <w:r>
+        <w:rPr>
+          <w:rStyle w:val="MdStrong"/>
+        </w:rPr>
+        <w:t>Adam — Hyperparameter Configurations and Cross-Validation Results:</w:t>
+      </w:r>
+    </w:p>
+    <w:p>
+      <w:pPr>
+        <w:pStyle w:val="MdSpace"/>
+        <w:spacing w:after="60"/>
+      </w:pPr>
+    </w:p>
+    <w:tbl>
+      <w:tblPr>
+        <w:tblW w:w="5000" w:type="pct"/>
+        <w:tblBorders>
+          <w:top w:val="single" w:sz="4" w:space="0" w:color="E1E4E8"/>
+          <w:bottom w:val="single" w:sz="4" w:space="0" w:color="E1E4E8"/>
+          <w:insideH w:val="single" w:sz="2" w:space="0" w:color="E1E4E8"/>
+          <w:insideV w:val="single" w:sz="2" w:space="0" w:color="F6F8FA"/>
+        </w:tblBorders>
+        <w:tblCellMar>
+          <w:left w:w="10" w:type="dxa"/>
+          <w:right w:w="10" w:type="dxa"/>
+        </w:tblCellMar>
+        <w:tblLook w:val="0000" w:firstRow="0" w:lastRow="0" w:firstColumn="0" w:lastColumn="0" w:noHBand="0" w:noVBand="0"/>
+      </w:tblPr>
+      <w:tblGrid>
+        <w:gridCol w:w="2100"/>
+        <w:gridCol w:w="922"/>
+        <w:gridCol w:w="572"/>
+        <w:gridCol w:w="1763"/>
+        <w:gridCol w:w="2526"/>
+        <w:gridCol w:w="1143"/>
+      </w:tblGrid>
+      <w:tr>
+        <w:tblPrEx>
+          <w:tblCellMar>
+            <w:top w:w="0" w:type="dxa"/>
+            <w:bottom w:w="0" w:type="dxa"/>
+          </w:tblCellMar>
+        </w:tblPrEx>
+        <w:trPr>
+          <w:cantSplit/>
+          <w:trHeight w:val="720"/>
+          <w:tblHeader/>
+        </w:trPr>
+        <w:tc>
+          <w:tcPr>
+            <w:tcW w:w="0" w:type="auto"/>
+            <w:tcMar>
+              <w:top w:w="100" w:type="dxa"/>
+              <w:left w:w="120" w:type="dxa"/>
+              <w:bottom w:w="100" w:type="dxa"/>
+              <w:right w:w="120" w:type="dxa"/>
+            </w:tcMar>
+            <w:vAlign w:val="center"/>
+          </w:tcPr>
+          <w:p>
+            <w:pPr>
+              <w:pStyle w:val="MdTableHeader"/>
+              <w:jc w:val="center"/>
+            </w:pPr>
+            <w:r>
+              <w:t>Configuration</w:t>
+            </w:r>
+          </w:p>
+        </w:tc>
+        <w:tc>
+          <w:tcPr>
+            <w:tcW w:w="0" w:type="auto"/>
+            <w:tcMar>
+              <w:top w:w="100" w:type="dxa"/>
+              <w:left w:w="120" w:type="dxa"/>
+              <w:bottom w:w="100" w:type="dxa"/>
+              <w:right w:w="120" w:type="dxa"/>
+            </w:tcMar>
+            <w:vAlign w:val="center"/>
+          </w:tcPr>
+          <w:p>
+            <w:pPr>
+              <w:pStyle w:val="MdTableHeader"/>
+              <w:jc w:val="center"/>
+            </w:pPr>
+            <w:r>
+              <w:rPr>
+                <w:u w:val="single"/>
+              </w:rPr>
+              <w:t>lr</w:t>
+            </w:r>
+          </w:p>
+        </w:tc>
+        <w:tc>
+          <w:tcPr>
+            <w:tcW w:w="0" w:type="auto"/>
+            <w:tcMar>
+              <w:top w:w="100" w:type="dxa"/>
+              <w:left w:w="120" w:type="dxa"/>
+              <w:bottom w:w="100" w:type="dxa"/>
+              <w:right w:w="120" w:type="dxa"/>
+            </w:tcMar>
+            <w:vAlign w:val="center"/>
+          </w:tcPr>
+          <w:p>
+            <w:pPr>
+              <w:pStyle w:val="MdTableHeader"/>
+              <w:jc w:val="center"/>
+            </w:pPr>
+            <w:r>
+              <w:rPr>
+                <w:u w:val="single"/>
+              </w:rPr>
+              <w:t>β1</w:t>
+            </w:r>
+          </w:p>
+        </w:tc>
+        <w:tc>
+          <w:tcPr>
+            <w:tcW w:w="0" w:type="auto"/>
+            <w:tcMar>
+              <w:top w:w="100" w:type="dxa"/>
+              <w:left w:w="120" w:type="dxa"/>
+              <w:bottom w:w="100" w:type="dxa"/>
+              <w:right w:w="120" w:type="dxa"/>
+            </w:tcMar>
+            <w:vAlign w:val="center"/>
+          </w:tcPr>
+          <w:p>
+            <w:pPr>
+              <w:pStyle w:val="MdTableHeader"/>
+              <w:jc w:val="center"/>
+            </w:pPr>
+            <w:r>
+              <w:rPr>
+                <w:u w:val="single"/>
+              </w:rPr>
+              <w:t>weight_decay</w:t>
+            </w:r>
+          </w:p>
+        </w:tc>
+        <w:tc>
+          <w:tcPr>
+            <w:tcW w:w="0" w:type="auto"/>
+            <w:tcMar>
+              <w:top w:w="100" w:type="dxa"/>
+              <w:left w:w="120" w:type="dxa"/>
+              <w:bottom w:w="100" w:type="dxa"/>
+              <w:right w:w="120" w:type="dxa"/>
+            </w:tcMar>
+            <w:vAlign w:val="center"/>
+          </w:tcPr>
+          <w:p>
+            <w:pPr>
+              <w:pStyle w:val="MdTableHeader"/>
+              <w:jc w:val="center"/>
+            </w:pPr>
+            <w:r>
+              <w:t>Mean Val. Accuracy</w:t>
+            </w:r>
+          </w:p>
+        </w:tc>
+        <w:tc>
+          <w:tcPr>
+            <w:tcW w:w="0" w:type="auto"/>
+            <w:tcMar>
+              <w:top w:w="100" w:type="dxa"/>
+              <w:left w:w="120" w:type="dxa"/>
+              <w:bottom w:w="100" w:type="dxa"/>
+              <w:right w:w="120" w:type="dxa"/>
+            </w:tcMar>
+            <w:vAlign w:val="center"/>
+          </w:tcPr>
+          <w:p>
+            <w:pPr>
+              <w:pStyle w:val="MdTableHeader"/>
+              <w:jc w:val="center"/>
+            </w:pPr>
+            <w:r>
+              <w:t>Std Dev</w:t>
+            </w:r>
+          </w:p>
+        </w:tc>
+      </w:tr>
+      <w:tr>
+        <w:tblPrEx>
+          <w:tblCellMar>
+            <w:top w:w="0" w:type="dxa"/>
+            <w:bottom w:w="0" w:type="dxa"/>
+          </w:tblCellMar>
+        </w:tblPrEx>
+        <w:trPr>
+          <w:cantSplit/>
+          <w:trHeight w:val="576"/>
+        </w:trPr>
+        <w:tc>
+          <w:tcPr>
+            <w:tcW w:w="0" w:type="auto"/>
+            <w:tcMar>
+              <w:top w:w="80" w:type="dxa"/>
+              <w:left w:w="120" w:type="dxa"/>
+              <w:bottom w:w="80" w:type="dxa"/>
+              <w:right w:w="120" w:type="dxa"/>
+            </w:tcMar>
+            <w:vAlign w:val="center"/>
+          </w:tcPr>
+          <w:p>
+            <w:pPr>
+              <w:pStyle w:val="MdTableCell"/>
+              <w:jc w:val="center"/>
+            </w:pPr>
+            <w:r>
+              <w:t>Config 1 (Default)</w:t>
+            </w:r>
+          </w:p>
+        </w:tc>
+        <w:tc>
+          <w:tcPr>
+            <w:tcW w:w="0" w:type="auto"/>
+            <w:tcMar>
+              <w:top w:w="80" w:type="dxa"/>
+              <w:left w:w="120" w:type="dxa"/>
+              <w:bottom w:w="80" w:type="dxa"/>
+              <w:right w:w="120" w:type="dxa"/>
+            </w:tcMar>
+            <w:vAlign w:val="center"/>
+          </w:tcPr>
+          <w:p>
+            <w:pPr>
+              <w:pStyle w:val="MdTableCell"/>
+              <w:jc w:val="center"/>
+            </w:pPr>
+            <w:r>
+              <w:t>0.001</w:t>
+            </w:r>
+          </w:p>
+        </w:tc>
+        <w:tc>
+          <w:tcPr>
+            <w:tcW w:w="0" w:type="auto"/>
+            <w:tcMar>
+              <w:top w:w="80" w:type="dxa"/>
+              <w:left w:w="120" w:type="dxa"/>
+              <w:bottom w:w="80" w:type="dxa"/>
+              <w:right w:w="120" w:type="dxa"/>
+            </w:tcMar>
+            <w:vAlign w:val="center"/>
+          </w:tcPr>
+          <w:p>
+            <w:pPr>
+              <w:pStyle w:val="MdTableCell"/>
+              <w:jc w:val="center"/>
+            </w:pPr>
+            <w:r>
+              <w:t>0.9</w:t>
+            </w:r>
+          </w:p>
+        </w:tc>
+        <w:tc>
+          <w:tcPr>
+            <w:tcW w:w="0" w:type="auto"/>
+            <w:tcMar>
+              <w:top w:w="80" w:type="dxa"/>
+              <w:left w:w="120" w:type="dxa"/>
+              <w:bottom w:w="80" w:type="dxa"/>
+              <w:right w:w="120" w:type="dxa"/>
+            </w:tcMar>
+            <w:vAlign w:val="center"/>
+          </w:tcPr>
+          <w:p>
+            <w:pPr>
+              <w:pStyle w:val="MdTableCell"/>
+              <w:jc w:val="center"/>
+            </w:pPr>
+            <w:r>
+              <w:t>1e-4</w:t>
+            </w:r>
+          </w:p>
+        </w:tc>
+        <w:tc>
+          <w:tcPr>
+            <w:tcW w:w="0" w:type="auto"/>
+            <w:tcMar>
+              <w:top w:w="80" w:type="dxa"/>
+              <w:left w:w="120" w:type="dxa"/>
+              <w:bottom w:w="80" w:type="dxa"/>
+              <w:right w:w="120" w:type="dxa"/>
+            </w:tcMar>
+            <w:vAlign w:val="center"/>
+          </w:tcPr>
+          <w:p>
+            <w:pPr>
+              <w:pStyle w:val="MdTableCell"/>
+              <w:jc w:val="center"/>
+            </w:pPr>
+            <w:r>
+              <w:t>95.58%</w:t>
+            </w:r>
+          </w:p>
+        </w:tc>
+        <w:tc>
+          <w:tcPr>
+            <w:tcW w:w="0" w:type="auto"/>
+            <w:tcMar>
+              <w:top w:w="80" w:type="dxa"/>
+              <w:left w:w="120" w:type="dxa"/>
+              <w:bottom w:w="80" w:type="dxa"/>
+              <w:right w:w="120" w:type="dxa"/>
+            </w:tcMar>
+            <w:vAlign w:val="center"/>
+          </w:tcPr>
+          <w:p>
+            <w:pPr>
+              <w:pStyle w:val="MdTableCell"/>
+              <w:jc w:val="center"/>
+            </w:pPr>
+            <w:r>
+              <w:t>—</w:t>
+            </w:r>
+          </w:p>
+        </w:tc>
+      </w:tr>
+      <w:tr>
+        <w:tblPrEx>
+          <w:tblCellMar>
+            <w:top w:w="0" w:type="dxa"/>
+            <w:bottom w:w="0" w:type="dxa"/>
+          </w:tblCellMar>
+        </w:tblPrEx>
+        <w:trPr>
+          <w:cantSplit/>
+          <w:trHeight w:val="576"/>
+        </w:trPr>
+        <w:tc>
+          <w:tcPr>
+            <w:tcW w:w="0" w:type="auto"/>
+            <w:tcMar>
+              <w:top w:w="80" w:type="dxa"/>
+              <w:left w:w="120" w:type="dxa"/>
+              <w:bottom w:w="80" w:type="dxa"/>
+              <w:right w:w="120" w:type="dxa"/>
+            </w:tcMar>
+            <w:vAlign w:val="center"/>
+          </w:tcPr>
+          <w:p>
+            <w:pPr>
+              <w:pStyle w:val="MdTableCell"/>
+              <w:jc w:val="center"/>
+            </w:pPr>
+            <w:r>
+              <w:rPr>
+                <w:rStyle w:val="MdStrong"/>
+              </w:rPr>
+              <w:t>Config 2 (Best)</w:t>
+            </w:r>
+          </w:p>
+        </w:tc>
+        <w:tc>
+          <w:tcPr>
+            <w:tcW w:w="0" w:type="auto"/>
+            <w:tcMar>
+              <w:top w:w="80" w:type="dxa"/>
+              <w:left w:w="120" w:type="dxa"/>
+              <w:bottom w:w="80" w:type="dxa"/>
+              <w:right w:w="120" w:type="dxa"/>
+            </w:tcMar>
+            <w:vAlign w:val="center"/>
+          </w:tcPr>
+          <w:p>
+            <w:pPr>
+              <w:pStyle w:val="MdTableCell"/>
+              <w:jc w:val="center"/>
+            </w:pPr>
+            <w:r>
+              <w:rPr>
+                <w:rStyle w:val="MdStrong"/>
+              </w:rPr>
+              <w:t>0.01</w:t>
+            </w:r>
+          </w:p>
+        </w:tc>
+        <w:tc>
+          <w:tcPr>
+            <w:tcW w:w="0" w:type="auto"/>
+            <w:tcMar>
+              <w:top w:w="80" w:type="dxa"/>
+              <w:left w:w="120" w:type="dxa"/>
+              <w:bottom w:w="80" w:type="dxa"/>
+              <w:right w:w="120" w:type="dxa"/>
+            </w:tcMar>
+            <w:vAlign w:val="center"/>
+          </w:tcPr>
+          <w:p>
+            <w:pPr>
+              <w:pStyle w:val="MdTableCell"/>
+              <w:jc w:val="center"/>
+            </w:pPr>
+            <w:r>
+              <w:rPr>
+                <w:rStyle w:val="MdStrong"/>
+              </w:rPr>
+              <w:t>0.9</w:t>
+            </w:r>
+          </w:p>
+        </w:tc>
+        <w:tc>
+          <w:tcPr>
+            <w:tcW w:w="0" w:type="auto"/>
+            <w:tcMar>
+              <w:top w:w="80" w:type="dxa"/>
+              <w:left w:w="120" w:type="dxa"/>
+              <w:bottom w:w="80" w:type="dxa"/>
+              <w:right w:w="120" w:type="dxa"/>
+            </w:tcMar>
+            <w:vAlign w:val="center"/>
+          </w:tcPr>
+          <w:p>
+            <w:pPr>
+              <w:pStyle w:val="MdTableCell"/>
+              <w:jc w:val="center"/>
+            </w:pPr>
+            <w:r>
+              <w:rPr>
+                <w:rStyle w:val="MdStrong"/>
+              </w:rPr>
+              <w:t>1e-3</w:t>
+            </w:r>
+          </w:p>
+        </w:tc>
+        <w:tc>
+          <w:tcPr>
+            <w:tcW w:w="0" w:type="auto"/>
+            <w:tcMar>
+              <w:top w:w="80" w:type="dxa"/>
+              <w:left w:w="120" w:type="dxa"/>
+              <w:bottom w:w="80" w:type="dxa"/>
+              <w:right w:w="120" w:type="dxa"/>
+            </w:tcMar>
+            <w:vAlign w:val="center"/>
+          </w:tcPr>
+          <w:p>
+            <w:pPr>
+              <w:pStyle w:val="MdTableCell"/>
+              <w:jc w:val="center"/>
+            </w:pPr>
+            <w:r>
+              <w:rPr>
+                <w:rStyle w:val="MdStrong"/>
+              </w:rPr>
+              <w:t>95.68%</w:t>
+            </w:r>
+          </w:p>
+        </w:tc>
+        <w:tc>
+          <w:tcPr>
+            <w:tcW w:w="0" w:type="auto"/>
+            <w:tcMar>
+              <w:top w:w="80" w:type="dxa"/>
+              <w:left w:w="120" w:type="dxa"/>
+              <w:bottom w:w="80" w:type="dxa"/>
+              <w:right w:w="120" w:type="dxa"/>
+            </w:tcMar>
+            <w:vAlign w:val="center"/>
+          </w:tcPr>
+          <w:p>
+            <w:pPr>
+              <w:pStyle w:val="MdTableCell"/>
+              <w:jc w:val="center"/>
+            </w:pPr>
+            <w:r>
+              <w:t>—</w:t>
+            </w:r>
+          </w:p>
+        </w:tc>
+      </w:tr>
+      <w:tr>
+        <w:tblPrEx>
+          <w:tblCellMar>
+            <w:top w:w="0" w:type="dxa"/>
+            <w:bottom w:w="0" w:type="dxa"/>
+          </w:tblCellMar>
+        </w:tblPrEx>
+        <w:trPr>
+          <w:cantSplit/>
+          <w:trHeight w:val="576"/>
+        </w:trPr>
+        <w:tc>
+          <w:tcPr>
+            <w:tcW w:w="0" w:type="auto"/>
+            <w:tcMar>
+              <w:top w:w="80" w:type="dxa"/>
+              <w:left w:w="120" w:type="dxa"/>
+              <w:bottom w:w="80" w:type="dxa"/>
+              <w:right w:w="120" w:type="dxa"/>
+            </w:tcMar>
+            <w:vAlign w:val="center"/>
+          </w:tcPr>
+          <w:p>
+            <w:pPr>
+              <w:pStyle w:val="MdTableCell"/>
+              <w:jc w:val="center"/>
+            </w:pPr>
+            <w:r>
+              <w:t>Config 3 (Low LR)</w:t>
+            </w:r>
+          </w:p>
+        </w:tc>
+        <w:tc>
+          <w:tcPr>
+            <w:tcW w:w="0" w:type="auto"/>
+            <w:tcMar>
+              <w:top w:w="80" w:type="dxa"/>
+              <w:left w:w="120" w:type="dxa"/>
+              <w:bottom w:w="80" w:type="dxa"/>
+              <w:right w:w="120" w:type="dxa"/>
+            </w:tcMar>
+            <w:vAlign w:val="center"/>
+          </w:tcPr>
+          <w:p>
+            <w:pPr>
+              <w:pStyle w:val="MdTableCell"/>
+              <w:jc w:val="center"/>
+            </w:pPr>
+            <w:r>
+              <w:t>0.0001</w:t>
+            </w:r>
+          </w:p>
+        </w:tc>
+        <w:tc>
+          <w:tcPr>
+            <w:tcW w:w="0" w:type="auto"/>
+            <w:tcMar>
+              <w:top w:w="80" w:type="dxa"/>
+              <w:left w:w="120" w:type="dxa"/>
+              <w:bottom w:w="80" w:type="dxa"/>
+              <w:right w:w="120" w:type="dxa"/>
+            </w:tcMar>
+            <w:vAlign w:val="center"/>
+          </w:tcPr>
+          <w:p>
+            <w:pPr>
+              <w:pStyle w:val="MdTableCell"/>
+              <w:jc w:val="center"/>
+            </w:pPr>
+            <w:r>
+              <w:t>0.9</w:t>
+            </w:r>
+          </w:p>
+        </w:tc>
+        <w:tc>
+          <w:tcPr>
+            <w:tcW w:w="0" w:type="auto"/>
+            <w:tcMar>
+              <w:top w:w="80" w:type="dxa"/>
+              <w:left w:w="120" w:type="dxa"/>
+              <w:bottom w:w="80" w:type="dxa"/>
+              <w:right w:w="120" w:type="dxa"/>
+            </w:tcMar>
+            <w:vAlign w:val="center"/>
+          </w:tcPr>
+          <w:p>
+            <w:pPr>
+              <w:pStyle w:val="MdTableCell"/>
+              <w:jc w:val="center"/>
+            </w:pPr>
+            <w:r>
+              <w:t>0.0</w:t>
+            </w:r>
+          </w:p>
+        </w:tc>
+        <w:tc>
+          <w:tcPr>
+            <w:tcW w:w="0" w:type="auto"/>
+            <w:tcMar>
+              <w:top w:w="80" w:type="dxa"/>
+              <w:left w:w="120" w:type="dxa"/>
+              <w:bottom w:w="80" w:type="dxa"/>
+              <w:right w:w="120" w:type="dxa"/>
+            </w:tcMar>
+            <w:vAlign w:val="center"/>
+          </w:tcPr>
+          <w:p>
+            <w:pPr>
+              <w:pStyle w:val="MdTableCell"/>
+              <w:jc w:val="center"/>
+            </w:pPr>
+            <w:r>
+              <w:t>94.15%</w:t>
+            </w:r>
+          </w:p>
+        </w:tc>
+        <w:tc>
+          <w:tcPr>
+            <w:tcW w:w="0" w:type="auto"/>
+            <w:tcMar>
+              <w:top w:w="80" w:type="dxa"/>
+              <w:left w:w="120" w:type="dxa"/>
+              <w:bottom w:w="80" w:type="dxa"/>
+              <w:right w:w="120" w:type="dxa"/>
+            </w:tcMar>
+            <w:vAlign w:val="center"/>
+          </w:tcPr>
+          <w:p>
+            <w:pPr>
+              <w:pStyle w:val="MdTableCell"/>
+              <w:jc w:val="center"/>
+            </w:pPr>
+            <w:r>
+              <w:t>—</w:t>
+            </w:r>
+          </w:p>
+        </w:tc>
+      </w:tr>
+      <w:tr>
+        <w:tblPrEx>
+          <w:tblCellMar>
+            <w:top w:w="0" w:type="dxa"/>
+            <w:bottom w:w="0" w:type="dxa"/>
+          </w:tblCellMar>
+        </w:tblPrEx>
+        <w:trPr>
+          <w:cantSplit/>
+          <w:trHeight w:val="576"/>
+        </w:trPr>
+        <w:tc>
+          <w:tcPr>
+            <w:tcW w:w="0" w:type="auto"/>
+            <w:tcBorders>
+              <w:bottom w:val="single" w:sz="4" w:space="0" w:color="E1E4E8"/>
+            </w:tcBorders>
+            <w:tcMar>
+              <w:top w:w="80" w:type="dxa"/>
+              <w:left w:w="120" w:type="dxa"/>
+              <w:bottom w:w="80" w:type="dxa"/>
+              <w:right w:w="120" w:type="dxa"/>
+            </w:tcMar>
+            <w:vAlign w:val="center"/>
+          </w:tcPr>
+          <w:p>
+            <w:pPr>
+              <w:pStyle w:val="MdTableCell"/>
+              <w:jc w:val="center"/>
+            </w:pPr>
+            <w:r>
+              <w:t>Config 4 (Low β1)</w:t>
+            </w:r>
+          </w:p>
+        </w:tc>
+        <w:tc>
+          <w:tcPr>
+            <w:tcW w:w="0" w:type="auto"/>
+            <w:tcBorders>
+              <w:bottom w:val="single" w:sz="4" w:space="0" w:color="E1E4E8"/>
+            </w:tcBorders>
+            <w:tcMar>
+              <w:top w:w="80" w:type="dxa"/>
+              <w:left w:w="120" w:type="dxa"/>
+              <w:bottom w:w="80" w:type="dxa"/>
+              <w:right w:w="120" w:type="dxa"/>
+            </w:tcMar>
+            <w:vAlign w:val="center"/>
+          </w:tcPr>
+          <w:p>
+            <w:pPr>
+              <w:pStyle w:val="MdTableCell"/>
+              <w:jc w:val="center"/>
+            </w:pPr>
+            <w:r>
+              <w:t>0.001</w:t>
+            </w:r>
+          </w:p>
+        </w:tc>
+        <w:tc>
+          <w:tcPr>
+            <w:tcW w:w="0" w:type="auto"/>
+            <w:tcBorders>
+              <w:bottom w:val="single" w:sz="4" w:space="0" w:color="E1E4E8"/>
+            </w:tcBorders>
+            <w:tcMar>
+              <w:top w:w="80" w:type="dxa"/>
+              <w:left w:w="120" w:type="dxa"/>
+              <w:bottom w:w="80" w:type="dxa"/>
+              <w:right w:w="120" w:type="dxa"/>
+            </w:tcMar>
+            <w:vAlign w:val="center"/>
+          </w:tcPr>
+          <w:p>
+            <w:pPr>
+              <w:pStyle w:val="MdTableCell"/>
+              <w:jc w:val="center"/>
+            </w:pPr>
+            <w:r>
+              <w:t>0.8</w:t>
+            </w:r>
+          </w:p>
+        </w:tc>
+        <w:tc>
+          <w:tcPr>
+            <w:tcW w:w="0" w:type="auto"/>
+            <w:tcBorders>
+              <w:bottom w:val="single" w:sz="4" w:space="0" w:color="E1E4E8"/>
+            </w:tcBorders>
+            <w:tcMar>
+              <w:top w:w="80" w:type="dxa"/>
+              <w:left w:w="120" w:type="dxa"/>
+              <w:bottom w:w="80" w:type="dxa"/>
+              <w:right w:w="120" w:type="dxa"/>
+            </w:tcMar>
+            <w:vAlign w:val="center"/>
+          </w:tcPr>
+          <w:p>
+            <w:pPr>
+              <w:pStyle w:val="MdTableCell"/>
+              <w:jc w:val="center"/>
+            </w:pPr>
+            <w:r>
+              <w:t>1e-2</w:t>
+            </w:r>
+          </w:p>
+        </w:tc>
+        <w:tc>
+          <w:tcPr>
+            <w:tcW w:w="0" w:type="auto"/>
+            <w:tcBorders>
+              <w:bottom w:val="single" w:sz="4" w:space="0" w:color="E1E4E8"/>
+            </w:tcBorders>
+            <w:tcMar>
+              <w:top w:w="80" w:type="dxa"/>
+              <w:left w:w="120" w:type="dxa"/>
+              <w:bottom w:w="80" w:type="dxa"/>
+              <w:right w:w="120" w:type="dxa"/>
+            </w:tcMar>
+            <w:vAlign w:val="center"/>
+          </w:tcPr>
+          <w:p>
+            <w:pPr>
+              <w:pStyle w:val="MdTableCell"/>
+              <w:jc w:val="center"/>
+            </w:pPr>
+            <w:r>
+              <w:t>95.67%</w:t>
+            </w:r>
+          </w:p>
+        </w:tc>
+        <w:tc>
+          <w:tcPr>
+            <w:tcW w:w="0" w:type="auto"/>
+            <w:tcBorders>
+              <w:bottom w:val="single" w:sz="4" w:space="0" w:color="E1E4E8"/>
+            </w:tcBorders>
+            <w:tcMar>
+              <w:top w:w="80" w:type="dxa"/>
+              <w:left w:w="120" w:type="dxa"/>
+              <w:bottom w:w="80" w:type="dxa"/>
+              <w:right w:w="120" w:type="dxa"/>
+            </w:tcMar>
+            <w:vAlign w:val="center"/>
+          </w:tcPr>
+          <w:p>
+            <w:pPr>
+              <w:pStyle w:val="MdTableCell"/>
+              <w:jc w:val="center"/>
+            </w:pPr>
+            <w:r>
+              <w:t>—</w:t>
+            </w:r>
+          </w:p>
+        </w:tc>
+      </w:tr>
+    </w:tbl>
+    <w:p>
+      <w:pPr>
+        <w:pStyle w:val="MdParagraph"/>
+      </w:pPr>
+      <w:r>
+        <w:rPr>
+          <w:rStyle w:val="MdStrong"/>
+        </w:rPr>
+        <w:t>Adam — Final Training Results (Best Configuration: lr=0.01, β1=0.9):</w:t>
+      </w:r>
+    </w:p>
+    <w:p>
+      <w:pPr>
+        <w:pStyle w:val="MdSpace"/>
+        <w:spacing w:after="60"/>
+      </w:pPr>
+    </w:p>
+    <w:tbl>
+      <w:tblPr>
+        <w:tblW w:w="5000" w:type="pct"/>
+        <w:tblBorders>
+          <w:top w:val="single" w:sz="4" w:space="0" w:color="E1E4E8"/>
+          <w:bottom w:val="single" w:sz="4" w:space="0" w:color="E1E4E8"/>
+          <w:insideH w:val="single" w:sz="2" w:space="0" w:color="E1E4E8"/>
+          <w:insideV w:val="single" w:sz="2" w:space="0" w:color="F6F8FA"/>
+        </w:tblBorders>
+        <w:tblCellMar>
+          <w:left w:w="10" w:type="dxa"/>
+          <w:right w:w="10" w:type="dxa"/>
+        </w:tblCellMar>
+        <w:tblLook w:val="0000" w:firstRow="0" w:lastRow="0" w:firstColumn="0" w:lastColumn="0" w:noHBand="0" w:noVBand="0"/>
+      </w:tblPr>
+      <w:tblGrid>
+        <w:gridCol w:w="5510"/>
+        <w:gridCol w:w="3516"/>
+      </w:tblGrid>
+      <w:tr>
+        <w:tblPrEx>
+          <w:tblCellMar>
+            <w:top w:w="0" w:type="dxa"/>
+            <w:bottom w:w="0" w:type="dxa"/>
+          </w:tblCellMar>
+        </w:tblPrEx>
+        <w:trPr>
+          <w:cantSplit/>
+          <w:trHeight w:val="720"/>
+          <w:tblHeader/>
+        </w:trPr>
+        <w:tc>
+          <w:tcPr>
+            <w:tcW w:w="0" w:type="auto"/>
+            <w:tcMar>
+              <w:top w:w="100" w:type="dxa"/>
+              <w:left w:w="120" w:type="dxa"/>
+              <w:bottom w:w="100" w:type="dxa"/>
+              <w:right w:w="120" w:type="dxa"/>
+            </w:tcMar>
+            <w:vAlign w:val="center"/>
+          </w:tcPr>
+          <w:p>
+            <w:pPr>
+              <w:pStyle w:val="MdTableHeader"/>
+            </w:pPr>
+            <w:r>
+              <w:t>Metric</w:t>
+            </w:r>
+          </w:p>
+        </w:tc>
+        <w:tc>
+          <w:tcPr>
+            <w:tcW w:w="0" w:type="auto"/>
+            <w:tcMar>
+              <w:top w:w="100" w:type="dxa"/>
+              <w:left w:w="120" w:type="dxa"/>
+              <w:bottom w:w="100" w:type="dxa"/>
+              <w:right w:w="120" w:type="dxa"/>
+            </w:tcMar>
+            <w:vAlign w:val="center"/>
+          </w:tcPr>
+          <w:p>
+            <w:pPr>
+              <w:pStyle w:val="MdTableHeader"/>
+            </w:pPr>
+            <w:r>
+              <w:t>Value</w:t>
+            </w:r>
+          </w:p>
+        </w:tc>
+      </w:tr>
+      <w:tr>
+        <w:tblPrEx>
+          <w:tblCellMar>
+            <w:top w:w="0" w:type="dxa"/>
+            <w:bottom w:w="0" w:type="dxa"/>
+          </w:tblCellMar>
+        </w:tblPrEx>
+        <w:trPr>
+          <w:cantSplit/>
+          <w:trHeight w:val="576"/>
+        </w:trPr>
+        <w:tc>
+          <w:tcPr>
+            <w:tcW w:w="0" w:type="auto"/>
+            <w:tcMar>
+              <w:top w:w="80" w:type="dxa"/>
+              <w:left w:w="120" w:type="dxa"/>
+              <w:bottom w:w="80" w:type="dxa"/>
+              <w:right w:w="120" w:type="dxa"/>
+            </w:tcMar>
+            <w:vAlign w:val="center"/>
+          </w:tcPr>
+          <w:p>
+            <w:pPr>
+              <w:pStyle w:val="MdTableCell"/>
+            </w:pPr>
+            <w:r>
+              <w:t>Training Accuracy (final epoch)</w:t>
+            </w:r>
+          </w:p>
+        </w:tc>
+        <w:tc>
+          <w:tcPr>
+            <w:tcW w:w="0" w:type="auto"/>
+            <w:tcMar>
+              <w:top w:w="80" w:type="dxa"/>
+              <w:left w:w="120" w:type="dxa"/>
+              <w:bottom w:w="80" w:type="dxa"/>
+              <w:right w:w="120" w:type="dxa"/>
+            </w:tcMar>
+            <w:vAlign w:val="center"/>
+          </w:tcPr>
+          <w:p>
+            <w:pPr>
+              <w:pStyle w:val="MdTableCell"/>
+            </w:pPr>
+            <w:r>
+              <w:t>95.26%</w:t>
+            </w:r>
+          </w:p>
+        </w:tc>
+      </w:tr>
+      <w:tr>
+        <w:tblPrEx>
+          <w:tblCellMar>
+            <w:top w:w="0" w:type="dxa"/>
+            <w:bottom w:w="0" w:type="dxa"/>
+          </w:tblCellMar>
+        </w:tblPrEx>
+        <w:trPr>
+          <w:cantSplit/>
+          <w:trHeight w:val="576"/>
+        </w:trPr>
+        <w:tc>
+          <w:tcPr>
+            <w:tcW w:w="0" w:type="auto"/>
+            <w:tcMar>
+              <w:top w:w="80" w:type="dxa"/>
+              <w:left w:w="120" w:type="dxa"/>
+              <w:bottom w:w="80" w:type="dxa"/>
+              <w:right w:w="120" w:type="dxa"/>
+            </w:tcMar>
+            <w:vAlign w:val="center"/>
+          </w:tcPr>
+          <w:p>
+            <w:pPr>
+              <w:pStyle w:val="MdTableCell"/>
+            </w:pPr>
+            <w:r>
+              <w:t>Best Test Accuracy</w:t>
+            </w:r>
+          </w:p>
+        </w:tc>
+        <w:tc>
+          <w:tcPr>
+            <w:tcW w:w="0" w:type="auto"/>
+            <w:tcMar>
+              <w:top w:w="80" w:type="dxa"/>
+              <w:left w:w="120" w:type="dxa"/>
+              <w:bottom w:w="80" w:type="dxa"/>
+              <w:right w:w="120" w:type="dxa"/>
+            </w:tcMar>
+            <w:vAlign w:val="center"/>
+          </w:tcPr>
+          <w:p>
+            <w:pPr>
+              <w:pStyle w:val="MdTableCell"/>
+            </w:pPr>
+            <w:r>
+              <w:t>89.91% (Epoch 16)</w:t>
+            </w:r>
+          </w:p>
+        </w:tc>
+      </w:tr>
+      <w:tr>
+        <w:tblPrEx>
+          <w:tblCellMar>
+            <w:top w:w="0" w:type="dxa"/>
+            <w:bottom w:w="0" w:type="dxa"/>
+          </w:tblCellMar>
+        </w:tblPrEx>
+        <w:trPr>
+          <w:cantSplit/>
+          <w:trHeight w:val="576"/>
+        </w:trPr>
+        <w:tc>
+          <w:tcPr>
+            <w:tcW w:w="0" w:type="auto"/>
+            <w:tcMar>
+              <w:top w:w="80" w:type="dxa"/>
+              <w:left w:w="120" w:type="dxa"/>
+              <w:bottom w:w="80" w:type="dxa"/>
+              <w:right w:w="120" w:type="dxa"/>
+            </w:tcMar>
+            <w:vAlign w:val="center"/>
+          </w:tcPr>
+          <w:p>
+            <w:pPr>
+              <w:pStyle w:val="MdTableCell"/>
+            </w:pPr>
+            <w:r>
+              <w:t>Final Test Loss</w:t>
+            </w:r>
+          </w:p>
+        </w:tc>
+        <w:tc>
+          <w:tcPr>
+            <w:tcW w:w="0" w:type="auto"/>
+            <w:tcMar>
+              <w:top w:w="80" w:type="dxa"/>
+              <w:left w:w="120" w:type="dxa"/>
+              <w:bottom w:w="80" w:type="dxa"/>
+              <w:right w:w="120" w:type="dxa"/>
+            </w:tcMar>
+            <w:vAlign w:val="center"/>
+          </w:tcPr>
+          <w:p>
+            <w:pPr>
+              <w:pStyle w:val="MdTableCell"/>
+            </w:pPr>
+            <w:r>
+              <w:t>0.3844</w:t>
+            </w:r>
+          </w:p>
+        </w:tc>
+      </w:tr>
+      <w:tr>
+        <w:tblPrEx>
+          <w:tblCellMar>
+            <w:top w:w="0" w:type="dxa"/>
+            <w:bottom w:w="0" w:type="dxa"/>
+          </w:tblCellMar>
+        </w:tblPrEx>
+        <w:trPr>
+          <w:cantSplit/>
+          <w:trHeight w:val="576"/>
+        </w:trPr>
+        <w:tc>
+          <w:tcPr>
+            <w:tcW w:w="0" w:type="auto"/>
+            <w:tcMar>
+              <w:top w:w="80" w:type="dxa"/>
+              <w:left w:w="120" w:type="dxa"/>
+              <w:bottom w:w="80" w:type="dxa"/>
+              <w:right w:w="120" w:type="dxa"/>
+            </w:tcMar>
+            <w:vAlign w:val="center"/>
+          </w:tcPr>
+          <w:p>
+            <w:pPr>
+              <w:pStyle w:val="MdTableCell"/>
+            </w:pPr>
+            <w:r>
+              <w:t>Generalization Gap</w:t>
+            </w:r>
+          </w:p>
+        </w:tc>
+        <w:tc>
+          <w:tcPr>
+            <w:tcW w:w="0" w:type="auto"/>
+            <w:tcMar>
+              <w:top w:w="80" w:type="dxa"/>
+              <w:left w:w="120" w:type="dxa"/>
+              <w:bottom w:w="80" w:type="dxa"/>
+              <w:right w:w="120" w:type="dxa"/>
+            </w:tcMar>
+            <w:vAlign w:val="center"/>
+          </w:tcPr>
+          <w:p>
+            <w:pPr>
+              <w:pStyle w:val="MdTableCell"/>
+            </w:pPr>
+            <w:r>
+              <w:t>~5.35%</w:t>
+            </w:r>
+          </w:p>
+        </w:tc>
+      </w:tr>
+      <w:tr>
+        <w:tblPrEx>
+          <w:tblCellMar>
+            <w:top w:w="0" w:type="dxa"/>
+            <w:bottom w:w="0" w:type="dxa"/>
+          </w:tblCellMar>
+        </w:tblPrEx>
+        <w:trPr>
+          <w:cantSplit/>
+          <w:trHeight w:val="576"/>
+        </w:trPr>
+        <w:tc>
+          <w:tcPr>
+            <w:tcW w:w="0" w:type="auto"/>
+            <w:tcBorders>
+              <w:bottom w:val="single" w:sz="4" w:space="0" w:color="E1E4E8"/>
+            </w:tcBorders>
+            <w:tcMar>
+              <w:top w:w="80" w:type="dxa"/>
+              <w:left w:w="120" w:type="dxa"/>
+              <w:bottom w:w="80" w:type="dxa"/>
+              <w:right w:w="120" w:type="dxa"/>
+            </w:tcMar>
+            <w:vAlign w:val="center"/>
+          </w:tcPr>
+          <w:p>
+            <w:pPr>
+              <w:pStyle w:val="MdTableCell"/>
+            </w:pPr>
+            <w:r>
+              <w:lastRenderedPageBreak/>
+              <w:t>Training Time per Fold (GPU)</w:t>
+            </w:r>
+          </w:p>
+        </w:tc>
+        <w:tc>
+          <w:tcPr>
+            <w:tcW w:w="0" w:type="auto"/>
+            <w:tcBorders>
+              <w:bottom w:val="single" w:sz="4" w:space="0" w:color="E1E4E8"/>
+            </w:tcBorders>
+            <w:tcMar>
+              <w:top w:w="80" w:type="dxa"/>
+              <w:left w:w="120" w:type="dxa"/>
+              <w:bottom w:w="80" w:type="dxa"/>
+              <w:right w:w="120" w:type="dxa"/>
+            </w:tcMar>
+            <w:vAlign w:val="center"/>
+          </w:tcPr>
+          <w:p>
+            <w:pPr>
+              <w:pStyle w:val="MdTableCell"/>
+            </w:pPr>
+            <w:r>
+              <w:t>~3–5 minutes</w:t>
+            </w:r>
+          </w:p>
+        </w:tc>
+      </w:tr>
+    </w:tbl>
+    <w:p>
+      <w:pPr>
         <w:pStyle w:val="MdHeading3"/>
       </w:pPr>
       <w:r>
         <w:t>5.2 Required Plots</w:t>
+      </w:r>
+    </w:p>
+    <w:p>
+      <w:pPr>
+        <w:pStyle w:val="MdParagraph"/>
+      </w:pPr>
+      <w:r>
+        <w:rPr>
+          <w:rStyle w:val="MdEm"/>
+        </w:rPr>
+        <w:t>[To be completed by Pessoa 5 — comparative plots for all three optimizers]</w:t>
       </w:r>
     </w:p>
     <w:p>
@@ -832,10 +2063,13 @@
     </w:p>
     <w:p>
       <w:pPr>
-        <w:pStyle w:val="MdHeading3"/>
-      </w:pPr>
-      <w:r>
-        <w:t>6.2 Weight Decay and Regularization</w:t>
+        <w:pStyle w:val="MdParagraph"/>
+      </w:pPr>
+      <w:r>
+        <w:rPr>
+          <w:rStyle w:val="MdStrong"/>
+        </w:rPr>
+        <w:t>Adam — Convergence Behaviour and Sensitivity (Thiago Segantini):</w:t>
       </w:r>
     </w:p>
     <w:p>
@@ -846,9 +2080,163 @@
     </w:p>
     <w:p>
       <w:pPr>
+        <w:pStyle w:val="MdParagraph"/>
+      </w:pPr>
+      <w:r>
+        <w:t xml:space="preserve">Adam demonstrated steady and consistent convergence on the KMNIST dataset. The optimizer was notably sensitive to the choice of learning rate. The higher learning rate configuration (Config 2, </w:t>
+      </w:r>
+      <w:r>
+        <w:rPr>
+          <w:u w:val="single"/>
+        </w:rPr>
+        <w:t>lr=0.01</w:t>
+      </w:r>
+      <w:r>
+        <w:t xml:space="preserve">) achieved the best result (95.68% mean validation accuracy) and converged significantly faster, starting with a training accuracy of approximately 84% at Epoch 1 compared to approximately 80% for the default configuration. In contrast, the lower learning rate (Config 3, </w:t>
+      </w:r>
+      <w:r>
+        <w:rPr>
+          <w:u w:val="single"/>
+        </w:rPr>
+        <w:t>lr=0.0001</w:t>
+      </w:r>
+      <w:r>
+        <w:t>) performed the worst (94.15%), starting at only ~58% training accuracy at Epoch 1 — clearly insufficient to converge within the 20-epoch limit.</w:t>
+      </w:r>
+    </w:p>
+    <w:p>
+      <w:pPr>
+        <w:pStyle w:val="MdSpace"/>
+        <w:spacing w:after="60"/>
+      </w:pPr>
+    </w:p>
+    <w:p>
+      <w:pPr>
+        <w:pStyle w:val="MdParagraph"/>
+      </w:pPr>
+      <w:r>
+        <w:t xml:space="preserve">Reducing the momentum parameter </w:t>
+      </w:r>
+      <w:r>
+        <w:rPr>
+          <w:u w:val="single"/>
+        </w:rPr>
+        <w:t>β1</w:t>
+      </w:r>
+      <w:r>
+        <w:t xml:space="preserve"> from 0.9 to 0.8 (Config 4) produced results virtually identical to the default (95.67% vs. 95.58%), suggesting that the first-moment decay rate is not a critical factor for this dataset and architecture.</w:t>
+      </w:r>
+    </w:p>
+    <w:p>
+      <w:pPr>
+        <w:pStyle w:val="MdSpace"/>
+        <w:spacing w:after="60"/>
+      </w:pPr>
+    </w:p>
+    <w:p>
+      <w:pPr>
+        <w:pStyle w:val="MdParagraph"/>
+      </w:pPr>
+      <w:r>
+        <w:t>An important failure mode was identified when combining a high learning rate (</w:t>
+      </w:r>
+      <w:r>
+        <w:rPr>
+          <w:u w:val="single"/>
+        </w:rPr>
+        <w:t>lr=0.01</w:t>
+      </w:r>
+      <w:r>
+        <w:t>) with aggressive weight decay (</w:t>
+      </w:r>
+      <w:r>
+        <w:rPr>
+          <w:u w:val="single"/>
+        </w:rPr>
+        <w:t>weight_decay=1e-3</w:t>
+      </w:r>
+      <w:r>
+        <w:t>): training accuracy stagnated at approximately 83% throughout all 20 epochs. This destructive interaction occurs because the optimizer takes large gradient steps while the weight decay simultaneously penalizes those weights, preventing the model from converging.</w:t>
+      </w:r>
+    </w:p>
+    <w:p>
+      <w:pPr>
+        <w:pStyle w:val="MdSpace"/>
+        <w:spacing w:after="60"/>
+      </w:pPr>
+    </w:p>
+    <w:p>
+      <w:pPr>
+        <w:pStyle w:val="MdParagraph"/>
+      </w:pPr>
+      <w:r>
+        <w:t>Using the best configuration (</w:t>
+      </w:r>
+      <w:r>
+        <w:rPr>
+          <w:u w:val="single"/>
+        </w:rPr>
+        <w:t>lr=0.01</w:t>
+      </w:r>
+      <w:r>
+        <w:t xml:space="preserve">, </w:t>
+      </w:r>
+      <w:r>
+        <w:rPr>
+          <w:u w:val="single"/>
+        </w:rPr>
+        <w:t>β1=0.9</w:t>
+      </w:r>
+      <w:r>
+        <w:t xml:space="preserve">), the final model achieved a best test accuracy of </w:t>
+      </w:r>
+      <w:r>
+        <w:rPr>
+          <w:rStyle w:val="MdStrong"/>
+        </w:rPr>
+        <w:t>89.91%</w:t>
+      </w:r>
+      <w:r>
+        <w:t xml:space="preserve"> with a generalization gap of approximately 5.35%, indicating moderate overfitting consistent with the absence of explicit regularization such as Dropout.</w:t>
+      </w:r>
+    </w:p>
+    <w:p>
+      <w:pPr>
+        <w:pStyle w:val="MdSpace"/>
+        <w:spacing w:after="60"/>
+      </w:pPr>
+    </w:p>
+    <w:p>
+      <w:pPr>
         <w:pStyle w:val="MdHeading3"/>
       </w:pPr>
       <w:r>
+        <w:lastRenderedPageBreak/>
+        <w:t>6.2 Weight Decay and Regularization</w:t>
+      </w:r>
+    </w:p>
+    <w:p>
+      <w:pPr>
+        <w:pStyle w:val="MdParagraph"/>
+      </w:pPr>
+      <w:r>
+        <w:rPr>
+          <w:rStyle w:val="MdEm"/>
+        </w:rPr>
+        <w:t>[To be completed by Pessoa 4 — comparing AdamW vs Adam]</w:t>
+      </w:r>
+    </w:p>
+    <w:p>
+      <w:pPr>
+        <w:pStyle w:val="MdSpace"/>
+        <w:spacing w:after="60"/>
+      </w:pPr>
+    </w:p>
+    <w:p>
+      <w:pPr>
+        <w:pStyle w:val="MdHeading3"/>
+      </w:pPr>
+      <w:r>
         <w:t>6.3 Conclusion and Recommendation</w:t>
       </w:r>
     </w:p>
@@ -856,6 +2244,12 @@
       <w:pPr>
         <w:pStyle w:val="MdParagraph"/>
       </w:pPr>
+      <w:r>
+        <w:rPr>
+          <w:rStyle w:val="MdEm"/>
+        </w:rPr>
+        <w:t>[To be completed by Pessoa 5]</w:t>
+      </w:r>
     </w:p>
     <w:p>
       <w:pPr>
@@ -883,6 +2277,97 @@
       </w:pPr>
       <w:r>
         <w:t>7. Individual Contribution Statements</w:t>
+      </w:r>
+    </w:p>
+    <w:p>
+      <w:pPr>
+        <w:pStyle w:val="MdParagraph"/>
+      </w:pPr>
+      <w:r>
+        <w:rPr>
+          <w:rStyle w:val="MdStrong"/>
+        </w:rPr>
+        <w:t>Thiago Segantini Nogueira:</w:t>
+      </w:r>
+      <w:r>
+        <w:t xml:space="preserve"> I was responsible for the systematic investigation of the Adam optimizer. I implemented the hyperparameter search strategy, testing four distinct configurations across 5-fold cross-validation on the KMNIST dataset. I analyzed the convergence behavior, evaluating the sensitivity of Adam to changes in learning rate, momentum (</w:t>
+      </w:r>
+      <w:r>
+        <w:rPr>
+          <w:u w:val="single"/>
+        </w:rPr>
+        <w:t>β1</w:t>
+      </w:r>
+      <w:r>
+        <w:t>), and weight decay. I identified a specific failure mode when combining high learning rates with aggressive weight decay. I also authored the theoretical background, methodology, and discussion sections for Adam in this report.</w:t>
+      </w:r>
+    </w:p>
+    <w:p>
+      <w:pPr>
+        <w:pStyle w:val="MdSpace"/>
+        <w:spacing w:after="60"/>
+      </w:pPr>
+    </w:p>
+    <w:p>
+      <w:pPr>
+        <w:pStyle w:val="MdParagraph"/>
+      </w:pPr>
+      <w:r>
+        <w:rPr>
+          <w:rStyle w:val="MdEm"/>
+        </w:rPr>
+        <w:t>[Kevin Joseff Cabrera — To be completed]</w:t>
+      </w:r>
+    </w:p>
+    <w:p>
+      <w:pPr>
+        <w:pStyle w:val="MdSpace"/>
+        <w:spacing w:after="60"/>
+      </w:pPr>
+    </w:p>
+    <w:p>
+      <w:pPr>
+        <w:pStyle w:val="MdParagraph"/>
+      </w:pPr>
+      <w:r>
+        <w:rPr>
+          <w:rStyle w:val="MdEm"/>
+        </w:rPr>
+        <w:t>[Mohd Mujtaba Saighani — To be completed]</w:t>
+      </w:r>
+    </w:p>
+    <w:p>
+      <w:pPr>
+        <w:pStyle w:val="MdSpace"/>
+        <w:spacing w:after="60"/>
+      </w:pPr>
+    </w:p>
+    <w:p>
+      <w:pPr>
+        <w:pStyle w:val="MdParagraph"/>
+      </w:pPr>
+      <w:r>
+        <w:rPr>
+          <w:rStyle w:val="MdEm"/>
+        </w:rPr>
+        <w:t>[Sayamon Sittiprom — To be completed]</w:t>
+      </w:r>
+    </w:p>
+    <w:p>
+      <w:pPr>
+        <w:pStyle w:val="MdSpace"/>
+        <w:spacing w:after="60"/>
+      </w:pPr>
+    </w:p>
+    <w:p>
+      <w:pPr>
+        <w:pStyle w:val="MdParagraph"/>
+      </w:pPr>
+      <w:r>
+        <w:rPr>
+          <w:rStyle w:val="MdEm"/>
+        </w:rPr>
+        <w:t>[Yao-Fu Yang — To be completed]</w:t>
       </w:r>
     </w:p>
     <w:p>
@@ -982,6 +2467,73 @@
         </w:rPr>
       </w:pPr>
     </w:p>
+    <w:p>
+      <w:pPr>
+        <w:pStyle w:val="MdParagraph"/>
+      </w:pPr>
+      <w:r>
+        <w:rPr>
+          <w:lang w:val="fr-CA"/>
+        </w:rPr>
+        <w:lastRenderedPageBreak/>
+        <w:t xml:space="preserve">Tieleman, T., &amp; Hinton, G. (2012). Lecture 6.5 - RMSProp. </w:t>
+      </w:r>
+      <w:r>
+        <w:rPr>
+          <w:rStyle w:val="MdEm"/>
+        </w:rPr>
+        <w:t>COURSERA: Neural Networks for Machine Learning</w:t>
+      </w:r>
+      <w:r>
+        <w:t xml:space="preserve">. </w:t>
+      </w:r>
+      <w:hyperlink r:id="rId12" w:history="1">
+        <w:r>
+          <w:rPr>
+            <w:rStyle w:val="MdLink"/>
+          </w:rPr>
+          <w:t>https://www.cs.toronto.edu/~tijmen/csc321/slides/lecture_slides_lec6.pdf</w:t>
+        </w:r>
+      </w:hyperlink>
+    </w:p>
+    <w:p>
+      <w:pPr>
+        <w:pStyle w:val="MdSpace"/>
+        <w:spacing w:after="60"/>
+      </w:pPr>
+    </w:p>
+    <w:p>
+      <w:pPr>
+        <w:pStyle w:val="MdParagraph"/>
+      </w:pPr>
+      <w:r>
+        <w:rPr>
+          <w:lang w:val="pt-BR"/>
+        </w:rPr>
+        <w:t xml:space="preserve">Clanuwat, T., Bober-Irizar, M., Kitamoto, A., Lamb, A., Yamamoto, K., &amp; Ha, D. (2018). </w:t>
+      </w:r>
+      <w:r>
+        <w:t xml:space="preserve">Deep learning for classical Japanese literature. </w:t>
+      </w:r>
+      <w:r>
+        <w:rPr>
+          <w:rStyle w:val="MdEm"/>
+        </w:rPr>
+        <w:t>NeurIPS 2018 Workshop on Machine Learning for Creativity and Design</w:t>
+      </w:r>
+      <w:r>
+        <w:t xml:space="preserve">. </w:t>
+      </w:r>
+      <w:hyperlink r:id="rId13" w:history="1">
+        <w:r>
+          <w:rPr>
+            <w:rStyle w:val="MdLink"/>
+          </w:rPr>
+          <w:t>https://arxiv.org/abs/1812.01718</w:t>
+        </w:r>
+      </w:hyperlink>
+    </w:p>
+    <w:p/>
     <w:sectPr>
       <w:pgSz w:w="11906" w:h="16838"/>
       <w:pgMar w:top="1440" w:right="1440" w:bottom="1440" w:left="1440" w:header="708" w:footer="708" w:gutter="0"/>
@@ -1731,7 +3283,6 @@
   <w:style w:type="character" w:default="1" w:styleId="Fontepargpadro">
     <w:name w:val="Default Paragraph Font"/>
     <w:uiPriority w:val="1"/>
-    <w:semiHidden/>
     <w:unhideWhenUsed/>
   </w:style>
   <w:style w:type="table" w:default="1" w:styleId="Tabelanormal">
@@ -2093,6 +3644,18 @@
     <w:uiPriority w:val="99"/>
     <w:unhideWhenUsed/>
     <w:qFormat/>
+  </w:style>
+  <w:style w:type="character" w:styleId="MenoPendente">
+    <w:name w:val="Unresolved Mention"/>
+    <w:basedOn w:val="Fontepargpadro"/>
+    <w:uiPriority w:val="99"/>
+    <w:semiHidden/>
+    <w:unhideWhenUsed/>
+    <w:rsid w:val="00017C42"/>
+    <w:rPr>
+      <w:color w:val="605E5C"/>
+      <w:shd w:val="clear" w:color="auto" w:fill="E1DFDD"/>
+    </w:rPr>
   </w:style>
 </w:styles>
 </file>

</xml_diff>

<commit_message>
Update Adam Report - Results
</commit_message>
<xml_diff>
--- a/report/Midterm_Report_Adam_Section.docx
+++ b/report/Midterm_Report_Adam_Section.docx
@@ -4,19 +4,24 @@
   <w:body>
     <w:p>
       <w:pPr>
-        <w:pStyle w:val="MdHeading1"/>
-      </w:pPr>
-      <w:r>
+        <w:rPr>
+          <w:b/>
+          <w:bCs/>
+        </w:rPr>
+      </w:pPr>
+      <w:r>
+        <w:rPr>
+          <w:b/>
+          <w:bCs/>
+        </w:rPr>
         <w:t>Midterm Project Report — Deep Learning Optimizers</w:t>
       </w:r>
     </w:p>
     <w:p>
-      <w:pPr>
-        <w:pStyle w:val="MdParagraph"/>
-      </w:pPr>
-      <w:r>
-        <w:rPr>
-          <w:rStyle w:val="MdStrong"/>
+      <w:r>
+        <w:rPr>
+          <w:b/>
+          <w:bCs/>
         </w:rPr>
         <w:t>AIGC 5500: Advanced Deep Learning</w:t>
       </w:r>
@@ -26,24 +31,21 @@
       <w:proofErr w:type="spellStart"/>
       <w:r>
         <w:rPr>
-          <w:rStyle w:val="MdStrong"/>
+          <w:b/>
+          <w:bCs/>
         </w:rPr>
         <w:t>HawkAI</w:t>
       </w:r>
       <w:proofErr w:type="spellEnd"/>
       <w:r>
         <w:rPr>
-          <w:rStyle w:val="MdStrong"/>
+          <w:b/>
+          <w:bCs/>
         </w:rPr>
         <w:t xml:space="preserve"> Detection Team | Group 1</w:t>
       </w:r>
     </w:p>
-    <w:p>
-      <w:pPr>
-        <w:pStyle w:val="MdSpace"/>
-        <w:spacing w:after="60"/>
-      </w:pPr>
-    </w:p>
+    <w:p/>
     <w:tbl>
       <w:tblPr>
         <w:tblW w:w="5000" w:type="pct"/>
@@ -57,11 +59,11 @@
           <w:left w:w="10" w:type="dxa"/>
           <w:right w:w="10" w:type="dxa"/>
         </w:tblCellMar>
-        <w:tblLook w:val="0000" w:firstRow="0" w:lastRow="0" w:firstColumn="0" w:lastColumn="0" w:noHBand="0" w:noVBand="0"/>
+        <w:tblLook w:val="04A0" w:firstRow="1" w:lastRow="0" w:firstColumn="1" w:lastColumn="0" w:noHBand="0" w:noVBand="1"/>
       </w:tblPr>
       <w:tblGrid>
-        <w:gridCol w:w="4891"/>
-        <w:gridCol w:w="4135"/>
+        <w:gridCol w:w="4897"/>
+        <w:gridCol w:w="4129"/>
       </w:tblGrid>
       <w:tr>
         <w:trPr>
@@ -72,6 +74,12 @@
         <w:tc>
           <w:tcPr>
             <w:tcW w:w="0" w:type="auto"/>
+            <w:tcBorders>
+              <w:top w:val="single" w:sz="4" w:space="0" w:color="E1E4E8"/>
+              <w:left w:val="nil"/>
+              <w:bottom w:val="single" w:sz="2" w:space="0" w:color="E1E4E8"/>
+              <w:right w:val="single" w:sz="2" w:space="0" w:color="F6F8FA"/>
+            </w:tcBorders>
             <w:tcMar>
               <w:top w:w="100" w:type="dxa"/>
               <w:left w:w="120" w:type="dxa"/>
@@ -79,12 +87,20 @@
               <w:right w:w="120" w:type="dxa"/>
             </w:tcMar>
             <w:vAlign w:val="center"/>
+            <w:hideMark/>
           </w:tcPr>
           <w:p>
             <w:pPr>
-              <w:pStyle w:val="MdTableHeader"/>
+              <w:rPr>
+                <w:b/>
+                <w:bCs/>
+              </w:rPr>
             </w:pPr>
             <w:r>
+              <w:rPr>
+                <w:b/>
+                <w:bCs/>
+              </w:rPr>
               <w:t>Name</w:t>
             </w:r>
           </w:p>
@@ -92,6 +108,12 @@
         <w:tc>
           <w:tcPr>
             <w:tcW w:w="0" w:type="auto"/>
+            <w:tcBorders>
+              <w:top w:val="single" w:sz="4" w:space="0" w:color="E1E4E8"/>
+              <w:left w:val="single" w:sz="2" w:space="0" w:color="F6F8FA"/>
+              <w:bottom w:val="single" w:sz="2" w:space="0" w:color="E1E4E8"/>
+              <w:right w:val="nil"/>
+            </w:tcBorders>
             <w:tcMar>
               <w:top w:w="100" w:type="dxa"/>
               <w:left w:w="120" w:type="dxa"/>
@@ -99,12 +121,20 @@
               <w:right w:w="120" w:type="dxa"/>
             </w:tcMar>
             <w:vAlign w:val="center"/>
+            <w:hideMark/>
           </w:tcPr>
           <w:p>
             <w:pPr>
-              <w:pStyle w:val="MdTableHeader"/>
+              <w:rPr>
+                <w:b/>
+                <w:bCs/>
+              </w:rPr>
             </w:pPr>
             <w:r>
+              <w:rPr>
+                <w:b/>
+                <w:bCs/>
+              </w:rPr>
               <w:t>GitHub</w:t>
             </w:r>
           </w:p>
@@ -118,6 +148,12 @@
         <w:tc>
           <w:tcPr>
             <w:tcW w:w="0" w:type="auto"/>
+            <w:tcBorders>
+              <w:top w:val="single" w:sz="2" w:space="0" w:color="E1E4E8"/>
+              <w:left w:val="nil"/>
+              <w:bottom w:val="single" w:sz="2" w:space="0" w:color="E1E4E8"/>
+              <w:right w:val="single" w:sz="2" w:space="0" w:color="F6F8FA"/>
+            </w:tcBorders>
             <w:tcMar>
               <w:top w:w="80" w:type="dxa"/>
               <w:left w:w="120" w:type="dxa"/>
@@ -125,11 +161,9 @@
               <w:right w:w="120" w:type="dxa"/>
             </w:tcMar>
             <w:vAlign w:val="center"/>
-          </w:tcPr>
-          <w:p>
-            <w:pPr>
-              <w:pStyle w:val="MdTableCell"/>
-            </w:pPr>
+            <w:hideMark/>
+          </w:tcPr>
+          <w:p>
             <w:r>
               <w:t>Kevin Joseff Cabrera (Kevin)</w:t>
             </w:r>
@@ -138,6 +172,12 @@
         <w:tc>
           <w:tcPr>
             <w:tcW w:w="0" w:type="auto"/>
+            <w:tcBorders>
+              <w:top w:val="single" w:sz="2" w:space="0" w:color="E1E4E8"/>
+              <w:left w:val="single" w:sz="2" w:space="0" w:color="F6F8FA"/>
+              <w:bottom w:val="single" w:sz="2" w:space="0" w:color="E1E4E8"/>
+              <w:right w:val="nil"/>
+            </w:tcBorders>
             <w:tcMar>
               <w:top w:w="80" w:type="dxa"/>
               <w:left w:w="120" w:type="dxa"/>
@@ -145,15 +185,13 @@
               <w:right w:w="120" w:type="dxa"/>
             </w:tcMar>
             <w:vAlign w:val="center"/>
-          </w:tcPr>
-          <w:p>
-            <w:pPr>
-              <w:pStyle w:val="MdTableCell"/>
-            </w:pPr>
+            <w:hideMark/>
+          </w:tcPr>
+          <w:p>
             <w:hyperlink r:id="rId5" w:history="1">
               <w:r>
                 <w:rPr>
-                  <w:rStyle w:val="MdLink"/>
+                  <w:rStyle w:val="Hyperlink"/>
                 </w:rPr>
                 <w:t>https://github.com/kjcabPL</w:t>
               </w:r>
@@ -169,6 +207,12 @@
         <w:tc>
           <w:tcPr>
             <w:tcW w:w="0" w:type="auto"/>
+            <w:tcBorders>
+              <w:top w:val="single" w:sz="2" w:space="0" w:color="E1E4E8"/>
+              <w:left w:val="nil"/>
+              <w:bottom w:val="single" w:sz="2" w:space="0" w:color="E1E4E8"/>
+              <w:right w:val="single" w:sz="2" w:space="0" w:color="F6F8FA"/>
+            </w:tcBorders>
             <w:tcMar>
               <w:top w:w="80" w:type="dxa"/>
               <w:left w:w="120" w:type="dxa"/>
@@ -176,11 +220,9 @@
               <w:right w:w="120" w:type="dxa"/>
             </w:tcMar>
             <w:vAlign w:val="center"/>
-          </w:tcPr>
-          <w:p>
-            <w:pPr>
-              <w:pStyle w:val="MdTableCell"/>
-            </w:pPr>
+            <w:hideMark/>
+          </w:tcPr>
+          <w:p>
             <w:r>
               <w:t>Mohd Mujtaba Saighani (Mujtaba)</w:t>
             </w:r>
@@ -189,6 +231,12 @@
         <w:tc>
           <w:tcPr>
             <w:tcW w:w="0" w:type="auto"/>
+            <w:tcBorders>
+              <w:top w:val="single" w:sz="2" w:space="0" w:color="E1E4E8"/>
+              <w:left w:val="single" w:sz="2" w:space="0" w:color="F6F8FA"/>
+              <w:bottom w:val="single" w:sz="2" w:space="0" w:color="E1E4E8"/>
+              <w:right w:val="nil"/>
+            </w:tcBorders>
             <w:tcMar>
               <w:top w:w="80" w:type="dxa"/>
               <w:left w:w="120" w:type="dxa"/>
@@ -196,15 +244,13 @@
               <w:right w:w="120" w:type="dxa"/>
             </w:tcMar>
             <w:vAlign w:val="center"/>
-          </w:tcPr>
-          <w:p>
-            <w:pPr>
-              <w:pStyle w:val="MdTableCell"/>
-            </w:pPr>
+            <w:hideMark/>
+          </w:tcPr>
+          <w:p>
             <w:hyperlink r:id="rId6" w:history="1">
               <w:r>
                 <w:rPr>
-                  <w:rStyle w:val="MdLink"/>
+                  <w:rStyle w:val="Hyperlink"/>
                 </w:rPr>
                 <w:t>https://github.com/saigha1</w:t>
               </w:r>
@@ -220,6 +266,12 @@
         <w:tc>
           <w:tcPr>
             <w:tcW w:w="0" w:type="auto"/>
+            <w:tcBorders>
+              <w:top w:val="single" w:sz="2" w:space="0" w:color="E1E4E8"/>
+              <w:left w:val="nil"/>
+              <w:bottom w:val="single" w:sz="2" w:space="0" w:color="E1E4E8"/>
+              <w:right w:val="single" w:sz="2" w:space="0" w:color="F6F8FA"/>
+            </w:tcBorders>
             <w:tcMar>
               <w:top w:w="80" w:type="dxa"/>
               <w:left w:w="120" w:type="dxa"/>
@@ -227,11 +279,9 @@
               <w:right w:w="120" w:type="dxa"/>
             </w:tcMar>
             <w:vAlign w:val="center"/>
-          </w:tcPr>
-          <w:p>
-            <w:pPr>
-              <w:pStyle w:val="MdTableCell"/>
-            </w:pPr>
+            <w:hideMark/>
+          </w:tcPr>
+          <w:p>
             <w:r>
               <w:t>Thiago Segantini Nogueira (Thiago)</w:t>
             </w:r>
@@ -240,6 +290,12 @@
         <w:tc>
           <w:tcPr>
             <w:tcW w:w="0" w:type="auto"/>
+            <w:tcBorders>
+              <w:top w:val="single" w:sz="2" w:space="0" w:color="E1E4E8"/>
+              <w:left w:val="single" w:sz="2" w:space="0" w:color="F6F8FA"/>
+              <w:bottom w:val="single" w:sz="2" w:space="0" w:color="E1E4E8"/>
+              <w:right w:val="nil"/>
+            </w:tcBorders>
             <w:tcMar>
               <w:top w:w="80" w:type="dxa"/>
               <w:left w:w="120" w:type="dxa"/>
@@ -247,15 +303,13 @@
               <w:right w:w="120" w:type="dxa"/>
             </w:tcMar>
             <w:vAlign w:val="center"/>
-          </w:tcPr>
-          <w:p>
-            <w:pPr>
-              <w:pStyle w:val="MdTableCell"/>
-            </w:pPr>
+            <w:hideMark/>
+          </w:tcPr>
+          <w:p>
             <w:hyperlink r:id="rId7" w:history="1">
               <w:r>
                 <w:rPr>
-                  <w:rStyle w:val="MdLink"/>
+                  <w:rStyle w:val="Hyperlink"/>
                 </w:rPr>
                 <w:t>https://github.com/thiaseg</w:t>
               </w:r>
@@ -271,6 +325,12 @@
         <w:tc>
           <w:tcPr>
             <w:tcW w:w="0" w:type="auto"/>
+            <w:tcBorders>
+              <w:top w:val="single" w:sz="2" w:space="0" w:color="E1E4E8"/>
+              <w:left w:val="nil"/>
+              <w:bottom w:val="single" w:sz="2" w:space="0" w:color="E1E4E8"/>
+              <w:right w:val="single" w:sz="2" w:space="0" w:color="F6F8FA"/>
+            </w:tcBorders>
             <w:tcMar>
               <w:top w:w="80" w:type="dxa"/>
               <w:left w:w="120" w:type="dxa"/>
@@ -278,11 +338,9 @@
               <w:right w:w="120" w:type="dxa"/>
             </w:tcMar>
             <w:vAlign w:val="center"/>
-          </w:tcPr>
-          <w:p>
-            <w:pPr>
-              <w:pStyle w:val="MdTableCell"/>
-            </w:pPr>
+            <w:hideMark/>
+          </w:tcPr>
+          <w:p>
             <w:proofErr w:type="spellStart"/>
             <w:r>
               <w:t>Sayamon</w:t>
@@ -304,6 +362,12 @@
         <w:tc>
           <w:tcPr>
             <w:tcW w:w="0" w:type="auto"/>
+            <w:tcBorders>
+              <w:top w:val="single" w:sz="2" w:space="0" w:color="E1E4E8"/>
+              <w:left w:val="single" w:sz="2" w:space="0" w:color="F6F8FA"/>
+              <w:bottom w:val="single" w:sz="2" w:space="0" w:color="E1E4E8"/>
+              <w:right w:val="nil"/>
+            </w:tcBorders>
             <w:tcMar>
               <w:top w:w="80" w:type="dxa"/>
               <w:left w:w="120" w:type="dxa"/>
@@ -311,15 +375,13 @@
               <w:right w:w="120" w:type="dxa"/>
             </w:tcMar>
             <w:vAlign w:val="center"/>
-          </w:tcPr>
-          <w:p>
-            <w:pPr>
-              <w:pStyle w:val="MdTableCell"/>
-            </w:pPr>
+            <w:hideMark/>
+          </w:tcPr>
+          <w:p>
             <w:hyperlink r:id="rId8" w:history="1">
               <w:r>
                 <w:rPr>
-                  <w:rStyle w:val="MdLink"/>
+                  <w:rStyle w:val="Hyperlink"/>
                 </w:rPr>
                 <w:t>https://github.com/sittiprom</w:t>
               </w:r>
@@ -336,7 +398,10 @@
           <w:tcPr>
             <w:tcW w:w="0" w:type="auto"/>
             <w:tcBorders>
+              <w:top w:val="single" w:sz="2" w:space="0" w:color="E1E4E8"/>
+              <w:left w:val="nil"/>
               <w:bottom w:val="single" w:sz="4" w:space="0" w:color="E1E4E8"/>
+              <w:right w:val="single" w:sz="2" w:space="0" w:color="F6F8FA"/>
             </w:tcBorders>
             <w:tcMar>
               <w:top w:w="80" w:type="dxa"/>
@@ -345,11 +410,9 @@
               <w:right w:w="120" w:type="dxa"/>
             </w:tcMar>
             <w:vAlign w:val="center"/>
-          </w:tcPr>
-          <w:p>
-            <w:pPr>
-              <w:pStyle w:val="MdTableCell"/>
-            </w:pPr>
+            <w:hideMark/>
+          </w:tcPr>
+          <w:p>
             <w:r>
               <w:t>Yao-Fu Yang (Andy)</w:t>
             </w:r>
@@ -359,7 +422,10 @@
           <w:tcPr>
             <w:tcW w:w="0" w:type="auto"/>
             <w:tcBorders>
+              <w:top w:val="single" w:sz="2" w:space="0" w:color="E1E4E8"/>
+              <w:left w:val="single" w:sz="2" w:space="0" w:color="F6F8FA"/>
               <w:bottom w:val="single" w:sz="4" w:space="0" w:color="E1E4E8"/>
+              <w:right w:val="nil"/>
             </w:tcBorders>
             <w:tcMar>
               <w:top w:w="80" w:type="dxa"/>
@@ -368,15 +434,13 @@
               <w:right w:w="120" w:type="dxa"/>
             </w:tcMar>
             <w:vAlign w:val="center"/>
-          </w:tcPr>
-          <w:p>
-            <w:pPr>
-              <w:pStyle w:val="MdTableCell"/>
-            </w:pPr>
+            <w:hideMark/>
+          </w:tcPr>
+          <w:p>
             <w:hyperlink r:id="rId9" w:history="1">
               <w:r>
                 <w:rPr>
-                  <w:rStyle w:val="MdLink"/>
+                  <w:rStyle w:val="Hyperlink"/>
                 </w:rPr>
                 <w:t>https://github.com/yaofu-yang</w:t>
               </w:r>
@@ -385,364 +449,388 @@
         </w:tc>
       </w:tr>
     </w:tbl>
+    <w:p/>
+    <w:p/>
     <w:p>
       <w:pPr>
-        <w:pStyle w:val="MdHr"/>
-        <w:pBdr>
-          <w:bottom w:val="single" w:sz="6" w:space="1" w:color="auto"/>
-        </w:pBdr>
-      </w:pPr>
+        <w:rPr>
+          <w:b/>
+          <w:bCs/>
+        </w:rPr>
+      </w:pPr>
+      <w:r>
+        <w:rPr>
+          <w:b/>
+          <w:bCs/>
+        </w:rPr>
+        <w:t>1. Project Introduction and Motivation</w:t>
+      </w:r>
+    </w:p>
+    <w:p/>
+    <w:p/>
+    <w:p/>
+    <w:p>
+      <w:pPr>
+        <w:rPr>
+          <w:b/>
+          <w:bCs/>
+        </w:rPr>
+      </w:pPr>
+      <w:r>
+        <w:rPr>
+          <w:b/>
+          <w:bCs/>
+        </w:rPr>
+        <w:t>2. Dataset and Model Description</w:t>
+      </w:r>
+    </w:p>
+    <w:p/>
+    <w:p/>
+    <w:p/>
+    <w:p>
+      <w:pPr>
+        <w:rPr>
+          <w:b/>
+          <w:bCs/>
+        </w:rPr>
+      </w:pPr>
+      <w:r>
+        <w:rPr>
+          <w:b/>
+          <w:bCs/>
+        </w:rPr>
+        <w:t>3. Optimizer Descriptions and Theoretical Background</w:t>
+      </w:r>
     </w:p>
     <w:p>
       <w:pPr>
-        <w:pStyle w:val="MdSpace"/>
-        <w:spacing w:after="60"/>
-      </w:pPr>
+        <w:rPr>
+          <w:b/>
+          <w:bCs/>
+        </w:rPr>
+      </w:pPr>
+      <w:r>
+        <w:rPr>
+          <w:b/>
+          <w:bCs/>
+        </w:rPr>
+        <w:t>3.1 Adam (Adaptive Moment Estimation)</w:t>
+      </w:r>
     </w:p>
     <w:p>
-      <w:pPr>
-        <w:pStyle w:val="MdHeading2"/>
-      </w:pPr>
-      <w:r>
-        <w:t>1. Project Introduction and Motivation</w:t>
+      <w:r>
+        <w:t xml:space="preserve">Adam (Adaptive Moment Estimation) is an optimization algorithm introduced by Kingma &amp; Ba (2015) that computes adaptive learning rates for each parameter. It combines the advantages of two other well-known extensions of stochastic gradient descent: momentum and RMSprop. Specifically, Adam maintains an exponentially decaying average of past gradients (the first moment, </w:t>
+      </w:r>
+      <w:proofErr w:type="gramStart"/>
+      <w:r>
+        <w:t>similar to</w:t>
+      </w:r>
+      <w:proofErr w:type="gramEnd"/>
+      <w:r>
+        <w:t xml:space="preserve"> momentum) and an exponentially decaying average of past squared gradients (the second moment, </w:t>
+      </w:r>
+      <w:proofErr w:type="gramStart"/>
+      <w:r>
+        <w:t>similar to</w:t>
+      </w:r>
+      <w:proofErr w:type="gramEnd"/>
+      <w:r>
+        <w:t xml:space="preserve"> RMSprop).</w:t>
+      </w:r>
+    </w:p>
+    <w:p/>
+    <w:p>
+      <w:r>
+        <w:t>The algorithm is governed by four primary hyperparameters: the global learning rate (</w:t>
+      </w:r>
+      <w:proofErr w:type="spellStart"/>
+      <w:r>
+        <w:rPr>
+          <w:u w:val="single"/>
+        </w:rPr>
+        <w:t>lr</w:t>
+      </w:r>
+      <w:proofErr w:type="spellEnd"/>
+      <w:r>
+        <w:t>, default 0.001), the exponential decay rate for the first moment estimates (</w:t>
+      </w:r>
+      <w:r>
+        <w:rPr>
+          <w:u w:val="single"/>
+        </w:rPr>
+        <w:t>β1</w:t>
+      </w:r>
+      <w:r>
+        <w:t>, default 0.9), the exponential decay rate for the second moment estimates (</w:t>
+      </w:r>
+      <w:r>
+        <w:rPr>
+          <w:u w:val="single"/>
+        </w:rPr>
+        <w:t>β2</w:t>
+      </w:r>
+      <w:r>
+        <w:t>, default 0.999), and a small numerical stability constant (</w:t>
+      </w:r>
+      <w:r>
+        <w:rPr>
+          <w:u w:val="single"/>
+        </w:rPr>
+        <w:t>ε</w:t>
+      </w:r>
+      <w:r>
+        <w:t xml:space="preserve">, default 1e-8). An optional </w:t>
+      </w:r>
+      <w:proofErr w:type="spellStart"/>
+      <w:r>
+        <w:rPr>
+          <w:u w:val="single"/>
+        </w:rPr>
+        <w:t>weight_decay</w:t>
+      </w:r>
+      <w:proofErr w:type="spellEnd"/>
+      <w:r>
+        <w:t xml:space="preserve"> parameter enables L2 regularization, though in Adam this regularization is applied in a coupled manner — directly modifying the gradient update — which is a known limitation compared to </w:t>
+      </w:r>
+      <w:proofErr w:type="spellStart"/>
+      <w:r>
+        <w:t>AdamW</w:t>
+      </w:r>
+      <w:proofErr w:type="spellEnd"/>
+      <w:r>
+        <w:t>, which decouples weight decay from the gradient update.</w:t>
+      </w:r>
+    </w:p>
+    <w:p/>
+    <w:p>
+      <w:r>
+        <w:t xml:space="preserve">Adam also incorporates bias correction in the first few iterations to prevent the moment estimates from being too small at the start of training. This adaptive approach makes Adam </w:t>
+      </w:r>
+      <w:r>
+        <w:lastRenderedPageBreak/>
+        <w:t>particularly effective for models with sparse gradients or noisy data, and it is generally robust to the initial choice of learning rate compared to standard SGD.</w:t>
+      </w:r>
+    </w:p>
+    <w:p/>
+    <w:p>
+      <w:pPr>
+        <w:rPr>
+          <w:b/>
+          <w:bCs/>
+        </w:rPr>
+      </w:pPr>
+      <w:r>
+        <w:rPr>
+          <w:b/>
+          <w:bCs/>
+        </w:rPr>
+        <w:t>3.2 RMSprop (Root Mean Square Propagation)</w:t>
+      </w:r>
+    </w:p>
+    <w:p/>
+    <w:p>
+      <w:pPr>
+        <w:rPr>
+          <w:b/>
+          <w:bCs/>
+        </w:rPr>
+      </w:pPr>
+      <w:r>
+        <w:rPr>
+          <w:b/>
+          <w:bCs/>
+        </w:rPr>
+        <w:t xml:space="preserve">3.3 </w:t>
+      </w:r>
+      <w:proofErr w:type="spellStart"/>
+      <w:r>
+        <w:rPr>
+          <w:b/>
+          <w:bCs/>
+        </w:rPr>
+        <w:t>AdamW</w:t>
+      </w:r>
+      <w:proofErr w:type="spellEnd"/>
+      <w:r>
+        <w:rPr>
+          <w:b/>
+          <w:bCs/>
+        </w:rPr>
+        <w:t xml:space="preserve"> (Adam with Decoupled Weight Decay)</w:t>
+      </w:r>
+    </w:p>
+    <w:p/>
+    <w:p/>
+    <w:p/>
+    <w:p>
+      <w:pPr>
+        <w:rPr>
+          <w:b/>
+          <w:bCs/>
+        </w:rPr>
+      </w:pPr>
+      <w:r>
+        <w:rPr>
+          <w:b/>
+          <w:bCs/>
+        </w:rPr>
+        <w:t>4. Methodology</w:t>
       </w:r>
     </w:p>
     <w:p>
       <w:pPr>
-        <w:pStyle w:val="MdSpace"/>
-        <w:spacing w:after="60"/>
-      </w:pPr>
+        <w:rPr>
+          <w:b/>
+          <w:bCs/>
+        </w:rPr>
+      </w:pPr>
+      <w:r>
+        <w:rPr>
+          <w:b/>
+          <w:bCs/>
+        </w:rPr>
+        <w:t>4.1 Hyperparameter Search Strategy</w:t>
+      </w:r>
+    </w:p>
+    <w:p/>
+    <w:p/>
+    <w:p>
+      <w:r>
+        <w:rPr>
+          <w:b/>
+          <w:bCs/>
+        </w:rPr>
+        <w:t>Adam — Search Strategy (Thiago Segantini):</w:t>
+      </w:r>
+      <w:r>
+        <w:t xml:space="preserve"> A manual systematic approach was employed for the Adam optimizer. The learning rate (</w:t>
+      </w:r>
+      <w:proofErr w:type="spellStart"/>
+      <w:r>
+        <w:rPr>
+          <w:u w:val="single"/>
+        </w:rPr>
+        <w:t>lr</w:t>
+      </w:r>
+      <w:proofErr w:type="spellEnd"/>
+      <w:r>
+        <w:t>) was varied across two orders of magnitude (from 0.0001 to 0.01) to isolate its effect on convergence speed and final accuracy. The effect of weight decay (</w:t>
+      </w:r>
+      <w:proofErr w:type="spellStart"/>
+      <w:r>
+        <w:rPr>
+          <w:u w:val="single"/>
+        </w:rPr>
+        <w:t>weight_decay</w:t>
+      </w:r>
+      <w:proofErr w:type="spellEnd"/>
+      <w:r>
+        <w:t xml:space="preserve">) was also investigated, testing values from 0.0 to 1e-2. A secondary investigation explicitly varied </w:t>
+      </w:r>
+      <w:r>
+        <w:rPr>
+          <w:u w:val="single"/>
+        </w:rPr>
+        <w:t>β1</w:t>
+      </w:r>
+      <w:r>
+        <w:t xml:space="preserve"> (from 0.9 to 0.8) alongside </w:t>
+      </w:r>
+      <w:proofErr w:type="spellStart"/>
+      <w:r>
+        <w:rPr>
+          <w:u w:val="single"/>
+        </w:rPr>
+        <w:t>weight_decay</w:t>
+      </w:r>
+      <w:proofErr w:type="spellEnd"/>
+      <w:r>
+        <w:t xml:space="preserve"> to confirm the effect of momentum on this dataset. The four configurations tested are described in Section 5.</w:t>
+      </w:r>
+    </w:p>
+    <w:p/>
+    <w:p>
+      <w:pPr>
+        <w:rPr>
+          <w:b/>
+          <w:bCs/>
+        </w:rPr>
+      </w:pPr>
+      <w:r>
+        <w:rPr>
+          <w:b/>
+          <w:bCs/>
+        </w:rPr>
+        <w:t>4.2 Cross-Validation Protocol</w:t>
+      </w:r>
+    </w:p>
+    <w:p/>
+    <w:p>
+      <w:pPr>
+        <w:rPr>
+          <w:b/>
+          <w:bCs/>
+        </w:rPr>
+      </w:pPr>
+      <w:r>
+        <w:rPr>
+          <w:b/>
+          <w:bCs/>
+        </w:rPr>
+        <w:t>4.3 Training Setup</w:t>
+      </w:r>
+    </w:p>
+    <w:p/>
+    <w:p/>
+    <w:p/>
+    <w:p>
+      <w:pPr>
+        <w:rPr>
+          <w:b/>
+          <w:bCs/>
+        </w:rPr>
+      </w:pPr>
+      <w:r>
+        <w:rPr>
+          <w:b/>
+          <w:bCs/>
+        </w:rPr>
+        <w:t>5. Results</w:t>
+      </w:r>
     </w:p>
     <w:p>
       <w:pPr>
-        <w:pStyle w:val="MdHr"/>
-        <w:pBdr>
-          <w:bottom w:val="single" w:sz="6" w:space="1" w:color="auto"/>
-        </w:pBdr>
-      </w:pPr>
+        <w:rPr>
+          <w:b/>
+          <w:bCs/>
+        </w:rPr>
+      </w:pPr>
+      <w:r>
+        <w:rPr>
+          <w:b/>
+          <w:bCs/>
+        </w:rPr>
+        <w:t>5.1 Summary Table</w:t>
+      </w:r>
     </w:p>
     <w:p>
       <w:pPr>
-        <w:pStyle w:val="MdSpace"/>
-        <w:spacing w:after="60"/>
+        <w:rPr>
+          <w:b/>
+          <w:bCs/>
+        </w:rPr>
       </w:pPr>
     </w:p>
     <w:p>
-      <w:pPr>
-        <w:pStyle w:val="MdHeading2"/>
-      </w:pPr>
-      <w:r>
-        <w:t>2. Dataset and Model Description</w:t>
+      <w:r>
+        <w:rPr>
+          <w:b/>
+          <w:bCs/>
+        </w:rPr>
+        <w:t>Adam — Hyperparameter Configurations and Cross-Validation Results:</w:t>
       </w:r>
     </w:p>
-    <w:p>
-      <w:pPr>
-        <w:pStyle w:val="MdSpace"/>
-        <w:spacing w:after="60"/>
-      </w:pPr>
-    </w:p>
-    <w:p>
-      <w:pPr>
-        <w:pStyle w:val="MdHr"/>
-        <w:pBdr>
-          <w:bottom w:val="single" w:sz="6" w:space="1" w:color="auto"/>
-        </w:pBdr>
-      </w:pPr>
-    </w:p>
-    <w:p>
-      <w:pPr>
-        <w:pStyle w:val="MdSpace"/>
-        <w:spacing w:after="60"/>
-      </w:pPr>
-    </w:p>
-    <w:p>
-      <w:pPr>
-        <w:pStyle w:val="MdHeading2"/>
-      </w:pPr>
-      <w:r>
-        <w:t>3. Optimizer Descriptions and Theoretical Background</w:t>
-      </w:r>
-    </w:p>
-    <w:p>
-      <w:pPr>
-        <w:pStyle w:val="MdHeading3"/>
-      </w:pPr>
-      <w:r>
-        <w:t>3.1 Adam (Adaptive Moment Estimation)</w:t>
-      </w:r>
-    </w:p>
-    <w:p>
-      <w:pPr>
-        <w:pStyle w:val="MdParagraph"/>
-      </w:pPr>
-      <w:r>
-        <w:t xml:space="preserve">Adam (Adaptive Moment Estimation) is an optimization algorithm introduced by Kingma &amp; Ba (2015) that computes adaptive learning rates for each parameter. It combines the advantages of two other well-known extensions of stochastic gradient descent: momentum </w:t>
-      </w:r>
-      <w:r>
-        <w:lastRenderedPageBreak/>
-        <w:t>and RMSprop. Specifically, Adam maintains an exponentially decaying average of past gradients (the first moment, similar to momentum) and an exponentially decaying average of past squared gradients (the second moment, similar to RMSprop).</w:t>
-      </w:r>
-    </w:p>
-    <w:p>
-      <w:pPr>
-        <w:pStyle w:val="MdSpace"/>
-        <w:spacing w:after="60"/>
-      </w:pPr>
-    </w:p>
-    <w:p>
-      <w:pPr>
-        <w:pStyle w:val="MdParagraph"/>
-      </w:pPr>
-      <w:r>
-        <w:t>The algorithm is governed by four primary hyperparameters: the global learning rate (</w:t>
-      </w:r>
-      <w:proofErr w:type="spellStart"/>
-      <w:r>
-        <w:rPr>
-          <w:u w:val="single"/>
-        </w:rPr>
-        <w:t>lr</w:t>
-      </w:r>
-      <w:proofErr w:type="spellEnd"/>
-      <w:r>
-        <w:t>, default 0.001), the exponential decay rate for the first moment estimates (</w:t>
-      </w:r>
-      <w:r>
-        <w:rPr>
-          <w:u w:val="single"/>
-        </w:rPr>
-        <w:t>β1</w:t>
-      </w:r>
-      <w:r>
-        <w:t>, default 0.9), the exponential decay rate for the second moment estimates (</w:t>
-      </w:r>
-      <w:r>
-        <w:rPr>
-          <w:u w:val="single"/>
-        </w:rPr>
-        <w:t>β2</w:t>
-      </w:r>
-      <w:r>
-        <w:t>, default 0.999), and a small numerical stability constant (</w:t>
-      </w:r>
-      <w:r>
-        <w:rPr>
-          <w:u w:val="single"/>
-        </w:rPr>
-        <w:t>ε</w:t>
-      </w:r>
-      <w:r>
-        <w:t>, default 1e-8). This adaptive approach makes Adam particularly effective for models with sparse gradients or noisy data, and it is generally robust to the initial choice of learning rate compared to standard SGD.</w:t>
-      </w:r>
-    </w:p>
-    <w:p>
-      <w:pPr>
-        <w:pStyle w:val="MdSpace"/>
-        <w:spacing w:after="60"/>
-      </w:pPr>
-    </w:p>
-    <w:p>
-      <w:pPr>
-        <w:pStyle w:val="MdHeading3"/>
-      </w:pPr>
-      <w:r>
-        <w:t>3.2 RMSprop (Root Mean Square Propagation)</w:t>
-      </w:r>
-    </w:p>
-    <w:p>
-      <w:pPr>
-        <w:pStyle w:val="MdSpace"/>
-        <w:spacing w:after="60"/>
-      </w:pPr>
-    </w:p>
-    <w:p>
-      <w:pPr>
-        <w:pStyle w:val="MdHeading3"/>
-      </w:pPr>
-      <w:r>
-        <w:t xml:space="preserve">3.3 </w:t>
-      </w:r>
-      <w:proofErr w:type="spellStart"/>
-      <w:r>
-        <w:t>AdamW</w:t>
-      </w:r>
-      <w:proofErr w:type="spellEnd"/>
-      <w:r>
-        <w:t xml:space="preserve"> (Adam with Decoupled Weight Decay)</w:t>
-      </w:r>
-    </w:p>
-    <w:p>
-      <w:pPr>
-        <w:pStyle w:val="MdSpace"/>
-        <w:spacing w:after="60"/>
-      </w:pPr>
-    </w:p>
-    <w:p>
-      <w:pPr>
-        <w:pStyle w:val="MdHr"/>
-        <w:pBdr>
-          <w:bottom w:val="single" w:sz="6" w:space="1" w:color="auto"/>
-        </w:pBdr>
-      </w:pPr>
-    </w:p>
-    <w:p>
-      <w:pPr>
-        <w:pStyle w:val="MdSpace"/>
-        <w:spacing w:after="60"/>
-      </w:pPr>
-    </w:p>
-    <w:p>
-      <w:pPr>
-        <w:pStyle w:val="MdHeading2"/>
-      </w:pPr>
-      <w:r>
-        <w:t>4. Methodology</w:t>
-      </w:r>
-    </w:p>
-    <w:p>
-      <w:pPr>
-        <w:pStyle w:val="MdHeading3"/>
-        <w:rPr>
-          <w:u w:val="single"/>
-        </w:rPr>
-      </w:pPr>
-      <w:r>
-        <w:t>4.1 Hyperparameter Search Strategy</w:t>
-      </w:r>
-    </w:p>
-    <w:p>
-      <w:pPr>
-        <w:pStyle w:val="MdParagraph"/>
-      </w:pPr>
-      <w:r>
-        <w:rPr>
-          <w:rStyle w:val="MdStrong"/>
-        </w:rPr>
-        <w:t>Adam — Search Strategy (Thiago Segantini):</w:t>
-      </w:r>
-      <w:r>
-        <w:t xml:space="preserve"> A manual systematic approach was employed for the Adam optimizer. The learning rate (</w:t>
-      </w:r>
-      <w:proofErr w:type="spellStart"/>
-      <w:r>
-        <w:rPr>
-          <w:u w:val="single"/>
-        </w:rPr>
-        <w:t>lr</w:t>
-      </w:r>
-      <w:proofErr w:type="spellEnd"/>
-      <w:r>
-        <w:t xml:space="preserve">) was varied across two orders of magnitude (from 0.0001 to 0.01) to isolate its effect on convergence speed and final accuracy. Additionally, the effect of momentum was investigated by altering the </w:t>
-      </w:r>
-      <w:r>
-        <w:rPr>
-          <w:u w:val="single"/>
-        </w:rPr>
-        <w:t>β1</w:t>
-      </w:r>
-      <w:r>
-        <w:t xml:space="preserve"> parameter, and the impact of regularization was tested by varying the </w:t>
-      </w:r>
-      <w:proofErr w:type="spellStart"/>
-      <w:r>
-        <w:rPr>
-          <w:u w:val="single"/>
-        </w:rPr>
-        <w:t>weight_decay</w:t>
-      </w:r>
-      <w:proofErr w:type="spellEnd"/>
-      <w:r>
-        <w:t xml:space="preserve"> parameter. The four configurations tested are described in Section 5.</w:t>
-      </w:r>
-    </w:p>
-    <w:p>
-      <w:pPr>
-        <w:pStyle w:val="MdSpace"/>
-        <w:spacing w:after="60"/>
-      </w:pPr>
-    </w:p>
-    <w:p>
-      <w:pPr>
-        <w:pStyle w:val="MdHeading3"/>
-      </w:pPr>
-      <w:r>
-        <w:t>4.2 Cross-Validation Protocol</w:t>
-      </w:r>
-    </w:p>
-    <w:p>
-      <w:pPr>
-        <w:pStyle w:val="MdSpace"/>
-        <w:spacing w:after="60"/>
-      </w:pPr>
-    </w:p>
-    <w:p>
-      <w:pPr>
-        <w:pStyle w:val="MdHeading3"/>
-      </w:pPr>
-      <w:r>
-        <w:t>4.3 Training Setup</w:t>
-      </w:r>
-    </w:p>
-    <w:p>
-      <w:pPr>
-        <w:pStyle w:val="MdSpace"/>
-        <w:spacing w:after="60"/>
-      </w:pPr>
-    </w:p>
-    <w:p>
-      <w:pPr>
-        <w:pStyle w:val="MdHr"/>
-        <w:pBdr>
-          <w:bottom w:val="single" w:sz="6" w:space="1" w:color="auto"/>
-        </w:pBdr>
-      </w:pPr>
-    </w:p>
-    <w:p>
-      <w:pPr>
-        <w:pStyle w:val="MdSpace"/>
-        <w:spacing w:after="60"/>
-      </w:pPr>
-    </w:p>
-    <w:p>
-      <w:pPr>
-        <w:pStyle w:val="MdHeading2"/>
-      </w:pPr>
-      <w:r>
-        <w:t>5. Results</w:t>
-      </w:r>
-    </w:p>
-    <w:p>
-      <w:pPr>
-        <w:pStyle w:val="MdHeading3"/>
-      </w:pPr>
-      <w:r>
-        <w:t>5.1 Summary Table</w:t>
-      </w:r>
-    </w:p>
-    <w:p>
-      <w:pPr>
-        <w:pStyle w:val="MdSpace"/>
-        <w:spacing w:after="60"/>
-      </w:pPr>
-    </w:p>
-    <w:p>
-      <w:pPr>
-        <w:pStyle w:val="MdParagraph"/>
-      </w:pPr>
-      <w:r>
-        <w:rPr>
-          <w:rStyle w:val="MdStrong"/>
-        </w:rPr>
-        <w:lastRenderedPageBreak/>
-        <w:t>Adam — Hyperparameter Configurations and Cross-Validation Results:</w:t>
-      </w:r>
-    </w:p>
-    <w:p>
-      <w:pPr>
-        <w:pStyle w:val="MdSpace"/>
-        <w:spacing w:after="60"/>
-      </w:pPr>
-    </w:p>
+    <w:p/>
     <w:tbl>
       <w:tblPr>
         <w:tblW w:w="5000" w:type="pct"/>
@@ -756,15 +844,14 @@
           <w:left w:w="10" w:type="dxa"/>
           <w:right w:w="10" w:type="dxa"/>
         </w:tblCellMar>
-        <w:tblLook w:val="0000" w:firstRow="0" w:lastRow="0" w:firstColumn="0" w:lastColumn="0" w:noHBand="0" w:noVBand="0"/>
+        <w:tblLook w:val="04A0" w:firstRow="1" w:lastRow="0" w:firstColumn="1" w:lastColumn="0" w:noHBand="0" w:noVBand="1"/>
       </w:tblPr>
       <w:tblGrid>
-        <w:gridCol w:w="2100"/>
-        <w:gridCol w:w="922"/>
-        <w:gridCol w:w="572"/>
-        <w:gridCol w:w="1763"/>
-        <w:gridCol w:w="2526"/>
-        <w:gridCol w:w="1143"/>
+        <w:gridCol w:w="2230"/>
+        <w:gridCol w:w="1131"/>
+        <w:gridCol w:w="679"/>
+        <w:gridCol w:w="2045"/>
+        <w:gridCol w:w="2941"/>
       </w:tblGrid>
       <w:tr>
         <w:trPr>
@@ -775,6 +862,12 @@
         <w:tc>
           <w:tcPr>
             <w:tcW w:w="0" w:type="auto"/>
+            <w:tcBorders>
+              <w:top w:val="single" w:sz="4" w:space="0" w:color="E1E4E8"/>
+              <w:left w:val="nil"/>
+              <w:bottom w:val="single" w:sz="2" w:space="0" w:color="E1E4E8"/>
+              <w:right w:val="single" w:sz="2" w:space="0" w:color="F6F8FA"/>
+            </w:tcBorders>
             <w:tcMar>
               <w:top w:w="100" w:type="dxa"/>
               <w:left w:w="120" w:type="dxa"/>
@@ -782,13 +875,20 @@
               <w:right w:w="120" w:type="dxa"/>
             </w:tcMar>
             <w:vAlign w:val="center"/>
+            <w:hideMark/>
           </w:tcPr>
           <w:p>
             <w:pPr>
-              <w:pStyle w:val="MdTableHeader"/>
-              <w:jc w:val="center"/>
+              <w:rPr>
+                <w:b/>
+                <w:bCs/>
+              </w:rPr>
             </w:pPr>
             <w:r>
+              <w:rPr>
+                <w:b/>
+                <w:bCs/>
+              </w:rPr>
               <w:t>Configuration</w:t>
             </w:r>
           </w:p>
@@ -796,6 +896,12 @@
         <w:tc>
           <w:tcPr>
             <w:tcW w:w="0" w:type="auto"/>
+            <w:tcBorders>
+              <w:top w:val="single" w:sz="4" w:space="0" w:color="E1E4E8"/>
+              <w:left w:val="single" w:sz="2" w:space="0" w:color="F6F8FA"/>
+              <w:bottom w:val="single" w:sz="2" w:space="0" w:color="E1E4E8"/>
+              <w:right w:val="single" w:sz="2" w:space="0" w:color="F6F8FA"/>
+            </w:tcBorders>
             <w:tcMar>
               <w:top w:w="100" w:type="dxa"/>
               <w:left w:w="120" w:type="dxa"/>
@@ -803,15 +909,20 @@
               <w:right w:w="120" w:type="dxa"/>
             </w:tcMar>
             <w:vAlign w:val="center"/>
+            <w:hideMark/>
           </w:tcPr>
           <w:p>
             <w:pPr>
-              <w:pStyle w:val="MdTableHeader"/>
-              <w:jc w:val="center"/>
+              <w:rPr>
+                <w:b/>
+                <w:bCs/>
+              </w:rPr>
             </w:pPr>
             <w:proofErr w:type="spellStart"/>
             <w:r>
               <w:rPr>
+                <w:b/>
+                <w:bCs/>
                 <w:u w:val="single"/>
               </w:rPr>
               <w:t>lr</w:t>
@@ -822,6 +933,12 @@
         <w:tc>
           <w:tcPr>
             <w:tcW w:w="0" w:type="auto"/>
+            <w:tcBorders>
+              <w:top w:val="single" w:sz="4" w:space="0" w:color="E1E4E8"/>
+              <w:left w:val="single" w:sz="2" w:space="0" w:color="F6F8FA"/>
+              <w:bottom w:val="single" w:sz="2" w:space="0" w:color="E1E4E8"/>
+              <w:right w:val="single" w:sz="2" w:space="0" w:color="F6F8FA"/>
+            </w:tcBorders>
             <w:tcMar>
               <w:top w:w="100" w:type="dxa"/>
               <w:left w:w="120" w:type="dxa"/>
@@ -829,14 +946,19 @@
               <w:right w:w="120" w:type="dxa"/>
             </w:tcMar>
             <w:vAlign w:val="center"/>
+            <w:hideMark/>
           </w:tcPr>
           <w:p>
             <w:pPr>
-              <w:pStyle w:val="MdTableHeader"/>
-              <w:jc w:val="center"/>
+              <w:rPr>
+                <w:b/>
+                <w:bCs/>
+              </w:rPr>
             </w:pPr>
             <w:r>
               <w:rPr>
+                <w:b/>
+                <w:bCs/>
                 <w:u w:val="single"/>
               </w:rPr>
               <w:t>β1</w:t>
@@ -846,6 +968,12 @@
         <w:tc>
           <w:tcPr>
             <w:tcW w:w="0" w:type="auto"/>
+            <w:tcBorders>
+              <w:top w:val="single" w:sz="4" w:space="0" w:color="E1E4E8"/>
+              <w:left w:val="single" w:sz="2" w:space="0" w:color="F6F8FA"/>
+              <w:bottom w:val="single" w:sz="2" w:space="0" w:color="E1E4E8"/>
+              <w:right w:val="single" w:sz="2" w:space="0" w:color="F6F8FA"/>
+            </w:tcBorders>
             <w:tcMar>
               <w:top w:w="100" w:type="dxa"/>
               <w:left w:w="120" w:type="dxa"/>
@@ -853,15 +981,20 @@
               <w:right w:w="120" w:type="dxa"/>
             </w:tcMar>
             <w:vAlign w:val="center"/>
+            <w:hideMark/>
           </w:tcPr>
           <w:p>
             <w:pPr>
-              <w:pStyle w:val="MdTableHeader"/>
-              <w:jc w:val="center"/>
+              <w:rPr>
+                <w:b/>
+                <w:bCs/>
+              </w:rPr>
             </w:pPr>
             <w:proofErr w:type="spellStart"/>
             <w:r>
               <w:rPr>
+                <w:b/>
+                <w:bCs/>
                 <w:u w:val="single"/>
               </w:rPr>
               <w:t>weight_decay</w:t>
@@ -872,6 +1005,12 @@
         <w:tc>
           <w:tcPr>
             <w:tcW w:w="0" w:type="auto"/>
+            <w:tcBorders>
+              <w:top w:val="single" w:sz="4" w:space="0" w:color="E1E4E8"/>
+              <w:left w:val="single" w:sz="2" w:space="0" w:color="F6F8FA"/>
+              <w:bottom w:val="single" w:sz="2" w:space="0" w:color="E1E4E8"/>
+              <w:right w:val="nil"/>
+            </w:tcBorders>
             <w:tcMar>
               <w:top w:w="100" w:type="dxa"/>
               <w:left w:w="120" w:type="dxa"/>
@@ -879,35 +1018,21 @@
               <w:right w:w="120" w:type="dxa"/>
             </w:tcMar>
             <w:vAlign w:val="center"/>
+            <w:hideMark/>
           </w:tcPr>
           <w:p>
             <w:pPr>
-              <w:pStyle w:val="MdTableHeader"/>
-              <w:jc w:val="center"/>
+              <w:rPr>
+                <w:b/>
+                <w:bCs/>
+              </w:rPr>
             </w:pPr>
             <w:r>
+              <w:rPr>
+                <w:b/>
+                <w:bCs/>
+              </w:rPr>
               <w:t>Mean Val. Accuracy</w:t>
-            </w:r>
-          </w:p>
-        </w:tc>
-        <w:tc>
-          <w:tcPr>
-            <w:tcW w:w="0" w:type="auto"/>
-            <w:tcMar>
-              <w:top w:w="100" w:type="dxa"/>
-              <w:left w:w="120" w:type="dxa"/>
-              <w:bottom w:w="100" w:type="dxa"/>
-              <w:right w:w="120" w:type="dxa"/>
-            </w:tcMar>
-            <w:vAlign w:val="center"/>
-          </w:tcPr>
-          <w:p>
-            <w:pPr>
-              <w:pStyle w:val="MdTableHeader"/>
-              <w:jc w:val="center"/>
-            </w:pPr>
-            <w:r>
-              <w:t>Std Dev</w:t>
             </w:r>
           </w:p>
         </w:tc>
@@ -920,6 +1045,12 @@
         <w:tc>
           <w:tcPr>
             <w:tcW w:w="0" w:type="auto"/>
+            <w:tcBorders>
+              <w:top w:val="single" w:sz="2" w:space="0" w:color="E1E4E8"/>
+              <w:left w:val="nil"/>
+              <w:bottom w:val="single" w:sz="2" w:space="0" w:color="E1E4E8"/>
+              <w:right w:val="single" w:sz="2" w:space="0" w:color="F6F8FA"/>
+            </w:tcBorders>
             <w:tcMar>
               <w:top w:w="80" w:type="dxa"/>
               <w:left w:w="120" w:type="dxa"/>
@@ -927,20 +1058,27 @@
               <w:right w:w="120" w:type="dxa"/>
             </w:tcMar>
             <w:vAlign w:val="center"/>
-          </w:tcPr>
-          <w:p>
-            <w:pPr>
-              <w:pStyle w:val="MdTableCell"/>
-              <w:jc w:val="center"/>
-            </w:pPr>
-            <w:r>
-              <w:t>Config 1 (Default)</w:t>
-            </w:r>
-          </w:p>
-        </w:tc>
-        <w:tc>
-          <w:tcPr>
-            <w:tcW w:w="0" w:type="auto"/>
+            <w:hideMark/>
+          </w:tcPr>
+          <w:p>
+            <w:r>
+              <w:rPr>
+                <w:b/>
+                <w:bCs/>
+              </w:rPr>
+              <w:t>Config 1 (Best)</w:t>
+            </w:r>
+          </w:p>
+        </w:tc>
+        <w:tc>
+          <w:tcPr>
+            <w:tcW w:w="0" w:type="auto"/>
+            <w:tcBorders>
+              <w:top w:val="single" w:sz="2" w:space="0" w:color="E1E4E8"/>
+              <w:left w:val="single" w:sz="2" w:space="0" w:color="F6F8FA"/>
+              <w:bottom w:val="single" w:sz="2" w:space="0" w:color="E1E4E8"/>
+              <w:right w:val="single" w:sz="2" w:space="0" w:color="F6F8FA"/>
+            </w:tcBorders>
             <w:tcMar>
               <w:top w:w="80" w:type="dxa"/>
               <w:left w:w="120" w:type="dxa"/>
@@ -948,13 +1086,14 @@
               <w:right w:w="120" w:type="dxa"/>
             </w:tcMar>
             <w:vAlign w:val="center"/>
-          </w:tcPr>
-          <w:p>
-            <w:pPr>
-              <w:pStyle w:val="MdTableCell"/>
-              <w:jc w:val="center"/>
-            </w:pPr>
-            <w:r>
+            <w:hideMark/>
+          </w:tcPr>
+          <w:p>
+            <w:r>
+              <w:rPr>
+                <w:b/>
+                <w:bCs/>
+              </w:rPr>
               <w:t>0.001</w:t>
             </w:r>
           </w:p>
@@ -962,6 +1101,12 @@
         <w:tc>
           <w:tcPr>
             <w:tcW w:w="0" w:type="auto"/>
+            <w:tcBorders>
+              <w:top w:val="single" w:sz="2" w:space="0" w:color="E1E4E8"/>
+              <w:left w:val="single" w:sz="2" w:space="0" w:color="F6F8FA"/>
+              <w:bottom w:val="single" w:sz="2" w:space="0" w:color="E1E4E8"/>
+              <w:right w:val="single" w:sz="2" w:space="0" w:color="F6F8FA"/>
+            </w:tcBorders>
             <w:tcMar>
               <w:top w:w="80" w:type="dxa"/>
               <w:left w:w="120" w:type="dxa"/>
@@ -969,13 +1114,14 @@
               <w:right w:w="120" w:type="dxa"/>
             </w:tcMar>
             <w:vAlign w:val="center"/>
-          </w:tcPr>
-          <w:p>
-            <w:pPr>
-              <w:pStyle w:val="MdTableCell"/>
-              <w:jc w:val="center"/>
-            </w:pPr>
-            <w:r>
+            <w:hideMark/>
+          </w:tcPr>
+          <w:p>
+            <w:r>
+              <w:rPr>
+                <w:b/>
+                <w:bCs/>
+              </w:rPr>
               <w:t>0.9</w:t>
             </w:r>
           </w:p>
@@ -983,6 +1129,12 @@
         <w:tc>
           <w:tcPr>
             <w:tcW w:w="0" w:type="auto"/>
+            <w:tcBorders>
+              <w:top w:val="single" w:sz="2" w:space="0" w:color="E1E4E8"/>
+              <w:left w:val="single" w:sz="2" w:space="0" w:color="F6F8FA"/>
+              <w:bottom w:val="single" w:sz="2" w:space="0" w:color="E1E4E8"/>
+              <w:right w:val="single" w:sz="2" w:space="0" w:color="F6F8FA"/>
+            </w:tcBorders>
             <w:tcMar>
               <w:top w:w="80" w:type="dxa"/>
               <w:left w:w="120" w:type="dxa"/>
@@ -990,13 +1142,14 @@
               <w:right w:w="120" w:type="dxa"/>
             </w:tcMar>
             <w:vAlign w:val="center"/>
-          </w:tcPr>
-          <w:p>
-            <w:pPr>
-              <w:pStyle w:val="MdTableCell"/>
-              <w:jc w:val="center"/>
-            </w:pPr>
-            <w:r>
+            <w:hideMark/>
+          </w:tcPr>
+          <w:p>
+            <w:r>
+              <w:rPr>
+                <w:b/>
+                <w:bCs/>
+              </w:rPr>
               <w:t>1e-4</w:t>
             </w:r>
           </w:p>
@@ -1004,6 +1157,12 @@
         <w:tc>
           <w:tcPr>
             <w:tcW w:w="0" w:type="auto"/>
+            <w:tcBorders>
+              <w:top w:val="single" w:sz="2" w:space="0" w:color="E1E4E8"/>
+              <w:left w:val="single" w:sz="2" w:space="0" w:color="F6F8FA"/>
+              <w:bottom w:val="single" w:sz="2" w:space="0" w:color="E1E4E8"/>
+              <w:right w:val="nil"/>
+            </w:tcBorders>
             <w:tcMar>
               <w:top w:w="80" w:type="dxa"/>
               <w:left w:w="120" w:type="dxa"/>
@@ -1011,35 +1170,15 @@
               <w:right w:w="120" w:type="dxa"/>
             </w:tcMar>
             <w:vAlign w:val="center"/>
-          </w:tcPr>
-          <w:p>
-            <w:pPr>
-              <w:pStyle w:val="MdTableCell"/>
-              <w:jc w:val="center"/>
-            </w:pPr>
-            <w:r>
-              <w:t>95.58%</w:t>
-            </w:r>
-          </w:p>
-        </w:tc>
-        <w:tc>
-          <w:tcPr>
-            <w:tcW w:w="0" w:type="auto"/>
-            <w:tcMar>
-              <w:top w:w="80" w:type="dxa"/>
-              <w:left w:w="120" w:type="dxa"/>
-              <w:bottom w:w="80" w:type="dxa"/>
-              <w:right w:w="120" w:type="dxa"/>
-            </w:tcMar>
-            <w:vAlign w:val="center"/>
-          </w:tcPr>
-          <w:p>
-            <w:pPr>
-              <w:pStyle w:val="MdTableCell"/>
-              <w:jc w:val="center"/>
-            </w:pPr>
-            <w:r>
-              <w:t>—</w:t>
+            <w:hideMark/>
+          </w:tcPr>
+          <w:p>
+            <w:r>
+              <w:rPr>
+                <w:b/>
+                <w:bCs/>
+              </w:rPr>
+              <w:t>95.61%</w:t>
             </w:r>
           </w:p>
         </w:tc>
@@ -1052,6 +1191,12 @@
         <w:tc>
           <w:tcPr>
             <w:tcW w:w="0" w:type="auto"/>
+            <w:tcBorders>
+              <w:top w:val="single" w:sz="2" w:space="0" w:color="E1E4E8"/>
+              <w:left w:val="nil"/>
+              <w:bottom w:val="single" w:sz="2" w:space="0" w:color="E1E4E8"/>
+              <w:right w:val="single" w:sz="2" w:space="0" w:color="F6F8FA"/>
+            </w:tcBorders>
             <w:tcMar>
               <w:top w:w="80" w:type="dxa"/>
               <w:left w:w="120" w:type="dxa"/>
@@ -1059,23 +1204,23 @@
               <w:right w:w="120" w:type="dxa"/>
             </w:tcMar>
             <w:vAlign w:val="center"/>
-          </w:tcPr>
-          <w:p>
-            <w:pPr>
-              <w:pStyle w:val="MdTableCell"/>
-              <w:jc w:val="center"/>
-            </w:pPr>
-            <w:r>
-              <w:rPr>
-                <w:rStyle w:val="MdStrong"/>
-              </w:rPr>
-              <w:t>Config 2 (Best)</w:t>
-            </w:r>
-          </w:p>
-        </w:tc>
-        <w:tc>
-          <w:tcPr>
-            <w:tcW w:w="0" w:type="auto"/>
+            <w:hideMark/>
+          </w:tcPr>
+          <w:p>
+            <w:r>
+              <w:t>Config 2</w:t>
+            </w:r>
+          </w:p>
+        </w:tc>
+        <w:tc>
+          <w:tcPr>
+            <w:tcW w:w="0" w:type="auto"/>
+            <w:tcBorders>
+              <w:top w:val="single" w:sz="2" w:space="0" w:color="E1E4E8"/>
+              <w:left w:val="single" w:sz="2" w:space="0" w:color="F6F8FA"/>
+              <w:bottom w:val="single" w:sz="2" w:space="0" w:color="E1E4E8"/>
+              <w:right w:val="single" w:sz="2" w:space="0" w:color="F6F8FA"/>
+            </w:tcBorders>
             <w:tcMar>
               <w:top w:w="80" w:type="dxa"/>
               <w:left w:w="120" w:type="dxa"/>
@@ -1083,16 +1228,10 @@
               <w:right w:w="120" w:type="dxa"/>
             </w:tcMar>
             <w:vAlign w:val="center"/>
-          </w:tcPr>
-          <w:p>
-            <w:pPr>
-              <w:pStyle w:val="MdTableCell"/>
-              <w:jc w:val="center"/>
-            </w:pPr>
-            <w:r>
-              <w:rPr>
-                <w:rStyle w:val="MdStrong"/>
-              </w:rPr>
+            <w:hideMark/>
+          </w:tcPr>
+          <w:p>
+            <w:r>
               <w:t>0.01</w:t>
             </w:r>
           </w:p>
@@ -1100,6 +1239,12 @@
         <w:tc>
           <w:tcPr>
             <w:tcW w:w="0" w:type="auto"/>
+            <w:tcBorders>
+              <w:top w:val="single" w:sz="2" w:space="0" w:color="E1E4E8"/>
+              <w:left w:val="single" w:sz="2" w:space="0" w:color="F6F8FA"/>
+              <w:bottom w:val="single" w:sz="2" w:space="0" w:color="E1E4E8"/>
+              <w:right w:val="single" w:sz="2" w:space="0" w:color="F6F8FA"/>
+            </w:tcBorders>
             <w:tcMar>
               <w:top w:w="80" w:type="dxa"/>
               <w:left w:w="120" w:type="dxa"/>
@@ -1107,16 +1252,10 @@
               <w:right w:w="120" w:type="dxa"/>
             </w:tcMar>
             <w:vAlign w:val="center"/>
-          </w:tcPr>
-          <w:p>
-            <w:pPr>
-              <w:pStyle w:val="MdTableCell"/>
-              <w:jc w:val="center"/>
-            </w:pPr>
-            <w:r>
-              <w:rPr>
-                <w:rStyle w:val="MdStrong"/>
-              </w:rPr>
+            <w:hideMark/>
+          </w:tcPr>
+          <w:p>
+            <w:r>
               <w:t>0.9</w:t>
             </w:r>
           </w:p>
@@ -1124,6 +1263,12 @@
         <w:tc>
           <w:tcPr>
             <w:tcW w:w="0" w:type="auto"/>
+            <w:tcBorders>
+              <w:top w:val="single" w:sz="2" w:space="0" w:color="E1E4E8"/>
+              <w:left w:val="single" w:sz="2" w:space="0" w:color="F6F8FA"/>
+              <w:bottom w:val="single" w:sz="2" w:space="0" w:color="E1E4E8"/>
+              <w:right w:val="single" w:sz="2" w:space="0" w:color="F6F8FA"/>
+            </w:tcBorders>
             <w:tcMar>
               <w:top w:w="80" w:type="dxa"/>
               <w:left w:w="120" w:type="dxa"/>
@@ -1131,16 +1276,10 @@
               <w:right w:w="120" w:type="dxa"/>
             </w:tcMar>
             <w:vAlign w:val="center"/>
-          </w:tcPr>
-          <w:p>
-            <w:pPr>
-              <w:pStyle w:val="MdTableCell"/>
-              <w:jc w:val="center"/>
-            </w:pPr>
-            <w:r>
-              <w:rPr>
-                <w:rStyle w:val="MdStrong"/>
-              </w:rPr>
+            <w:hideMark/>
+          </w:tcPr>
+          <w:p>
+            <w:r>
               <w:t>1e-3</w:t>
             </w:r>
           </w:p>
@@ -1148,6 +1287,12 @@
         <w:tc>
           <w:tcPr>
             <w:tcW w:w="0" w:type="auto"/>
+            <w:tcBorders>
+              <w:top w:val="single" w:sz="2" w:space="0" w:color="E1E4E8"/>
+              <w:left w:val="single" w:sz="2" w:space="0" w:color="F6F8FA"/>
+              <w:bottom w:val="single" w:sz="2" w:space="0" w:color="E1E4E8"/>
+              <w:right w:val="nil"/>
+            </w:tcBorders>
             <w:tcMar>
               <w:top w:w="80" w:type="dxa"/>
               <w:left w:w="120" w:type="dxa"/>
@@ -1155,38 +1300,11 @@
               <w:right w:w="120" w:type="dxa"/>
             </w:tcMar>
             <w:vAlign w:val="center"/>
-          </w:tcPr>
-          <w:p>
-            <w:pPr>
-              <w:pStyle w:val="MdTableCell"/>
-              <w:jc w:val="center"/>
-            </w:pPr>
-            <w:r>
-              <w:rPr>
-                <w:rStyle w:val="MdStrong"/>
-              </w:rPr>
-              <w:t>95.68%</w:t>
-            </w:r>
-          </w:p>
-        </w:tc>
-        <w:tc>
-          <w:tcPr>
-            <w:tcW w:w="0" w:type="auto"/>
-            <w:tcMar>
-              <w:top w:w="80" w:type="dxa"/>
-              <w:left w:w="120" w:type="dxa"/>
-              <w:bottom w:w="80" w:type="dxa"/>
-              <w:right w:w="120" w:type="dxa"/>
-            </w:tcMar>
-            <w:vAlign w:val="center"/>
-          </w:tcPr>
-          <w:p>
-            <w:pPr>
-              <w:pStyle w:val="MdTableCell"/>
-              <w:jc w:val="center"/>
-            </w:pPr>
-            <w:r>
-              <w:t>—</w:t>
+            <w:hideMark/>
+          </w:tcPr>
+          <w:p>
+            <w:r>
+              <w:t>95.68%*</w:t>
             </w:r>
           </w:p>
         </w:tc>
@@ -1199,6 +1317,12 @@
         <w:tc>
           <w:tcPr>
             <w:tcW w:w="0" w:type="auto"/>
+            <w:tcBorders>
+              <w:top w:val="single" w:sz="2" w:space="0" w:color="E1E4E8"/>
+              <w:left w:val="nil"/>
+              <w:bottom w:val="single" w:sz="2" w:space="0" w:color="E1E4E8"/>
+              <w:right w:val="single" w:sz="2" w:space="0" w:color="F6F8FA"/>
+            </w:tcBorders>
             <w:tcMar>
               <w:top w:w="80" w:type="dxa"/>
               <w:left w:w="120" w:type="dxa"/>
@@ -1206,20 +1330,23 @@
               <w:right w:w="120" w:type="dxa"/>
             </w:tcMar>
             <w:vAlign w:val="center"/>
-          </w:tcPr>
-          <w:p>
-            <w:pPr>
-              <w:pStyle w:val="MdTableCell"/>
-              <w:jc w:val="center"/>
-            </w:pPr>
-            <w:r>
-              <w:t>Config 3 (Low LR)</w:t>
-            </w:r>
-          </w:p>
-        </w:tc>
-        <w:tc>
-          <w:tcPr>
-            <w:tcW w:w="0" w:type="auto"/>
+            <w:hideMark/>
+          </w:tcPr>
+          <w:p>
+            <w:r>
+              <w:t>Config 3</w:t>
+            </w:r>
+          </w:p>
+        </w:tc>
+        <w:tc>
+          <w:tcPr>
+            <w:tcW w:w="0" w:type="auto"/>
+            <w:tcBorders>
+              <w:top w:val="single" w:sz="2" w:space="0" w:color="E1E4E8"/>
+              <w:left w:val="single" w:sz="2" w:space="0" w:color="F6F8FA"/>
+              <w:bottom w:val="single" w:sz="2" w:space="0" w:color="E1E4E8"/>
+              <w:right w:val="single" w:sz="2" w:space="0" w:color="F6F8FA"/>
+            </w:tcBorders>
             <w:tcMar>
               <w:top w:w="80" w:type="dxa"/>
               <w:left w:w="120" w:type="dxa"/>
@@ -1227,12 +1354,9 @@
               <w:right w:w="120" w:type="dxa"/>
             </w:tcMar>
             <w:vAlign w:val="center"/>
-          </w:tcPr>
-          <w:p>
-            <w:pPr>
-              <w:pStyle w:val="MdTableCell"/>
-              <w:jc w:val="center"/>
-            </w:pPr>
+            <w:hideMark/>
+          </w:tcPr>
+          <w:p>
             <w:r>
               <w:t>0.0001</w:t>
             </w:r>
@@ -1241,6 +1365,12 @@
         <w:tc>
           <w:tcPr>
             <w:tcW w:w="0" w:type="auto"/>
+            <w:tcBorders>
+              <w:top w:val="single" w:sz="2" w:space="0" w:color="E1E4E8"/>
+              <w:left w:val="single" w:sz="2" w:space="0" w:color="F6F8FA"/>
+              <w:bottom w:val="single" w:sz="2" w:space="0" w:color="E1E4E8"/>
+              <w:right w:val="single" w:sz="2" w:space="0" w:color="F6F8FA"/>
+            </w:tcBorders>
             <w:tcMar>
               <w:top w:w="80" w:type="dxa"/>
               <w:left w:w="120" w:type="dxa"/>
@@ -1248,12 +1378,9 @@
               <w:right w:w="120" w:type="dxa"/>
             </w:tcMar>
             <w:vAlign w:val="center"/>
-          </w:tcPr>
-          <w:p>
-            <w:pPr>
-              <w:pStyle w:val="MdTableCell"/>
-              <w:jc w:val="center"/>
-            </w:pPr>
+            <w:hideMark/>
+          </w:tcPr>
+          <w:p>
             <w:r>
               <w:t>0.9</w:t>
             </w:r>
@@ -1262,6 +1389,12 @@
         <w:tc>
           <w:tcPr>
             <w:tcW w:w="0" w:type="auto"/>
+            <w:tcBorders>
+              <w:top w:val="single" w:sz="2" w:space="0" w:color="E1E4E8"/>
+              <w:left w:val="single" w:sz="2" w:space="0" w:color="F6F8FA"/>
+              <w:bottom w:val="single" w:sz="2" w:space="0" w:color="E1E4E8"/>
+              <w:right w:val="single" w:sz="2" w:space="0" w:color="F6F8FA"/>
+            </w:tcBorders>
             <w:tcMar>
               <w:top w:w="80" w:type="dxa"/>
               <w:left w:w="120" w:type="dxa"/>
@@ -1269,12 +1402,9 @@
               <w:right w:w="120" w:type="dxa"/>
             </w:tcMar>
             <w:vAlign w:val="center"/>
-          </w:tcPr>
-          <w:p>
-            <w:pPr>
-              <w:pStyle w:val="MdTableCell"/>
-              <w:jc w:val="center"/>
-            </w:pPr>
+            <w:hideMark/>
+          </w:tcPr>
+          <w:p>
             <w:r>
               <w:t>0.0</w:t>
             </w:r>
@@ -1283,6 +1413,12 @@
         <w:tc>
           <w:tcPr>
             <w:tcW w:w="0" w:type="auto"/>
+            <w:tcBorders>
+              <w:top w:val="single" w:sz="2" w:space="0" w:color="E1E4E8"/>
+              <w:left w:val="single" w:sz="2" w:space="0" w:color="F6F8FA"/>
+              <w:bottom w:val="single" w:sz="2" w:space="0" w:color="E1E4E8"/>
+              <w:right w:val="nil"/>
+            </w:tcBorders>
             <w:tcMar>
               <w:top w:w="80" w:type="dxa"/>
               <w:left w:w="120" w:type="dxa"/>
@@ -1290,35 +1426,11 @@
               <w:right w:w="120" w:type="dxa"/>
             </w:tcMar>
             <w:vAlign w:val="center"/>
-          </w:tcPr>
-          <w:p>
-            <w:pPr>
-              <w:pStyle w:val="MdTableCell"/>
-              <w:jc w:val="center"/>
-            </w:pPr>
+            <w:hideMark/>
+          </w:tcPr>
+          <w:p>
             <w:r>
               <w:t>94.15%</w:t>
-            </w:r>
-          </w:p>
-        </w:tc>
-        <w:tc>
-          <w:tcPr>
-            <w:tcW w:w="0" w:type="auto"/>
-            <w:tcMar>
-              <w:top w:w="80" w:type="dxa"/>
-              <w:left w:w="120" w:type="dxa"/>
-              <w:bottom w:w="80" w:type="dxa"/>
-              <w:right w:w="120" w:type="dxa"/>
-            </w:tcMar>
-            <w:vAlign w:val="center"/>
-          </w:tcPr>
-          <w:p>
-            <w:pPr>
-              <w:pStyle w:val="MdTableCell"/>
-              <w:jc w:val="center"/>
-            </w:pPr>
-            <w:r>
-              <w:t>—</w:t>
             </w:r>
           </w:p>
         </w:tc>
@@ -1332,7 +1444,10 @@
           <w:tcPr>
             <w:tcW w:w="0" w:type="auto"/>
             <w:tcBorders>
+              <w:top w:val="single" w:sz="2" w:space="0" w:color="E1E4E8"/>
+              <w:left w:val="nil"/>
               <w:bottom w:val="single" w:sz="4" w:space="0" w:color="E1E4E8"/>
+              <w:right w:val="single" w:sz="2" w:space="0" w:color="F6F8FA"/>
             </w:tcBorders>
             <w:tcMar>
               <w:top w:w="80" w:type="dxa"/>
@@ -1341,22 +1456,22 @@
               <w:right w:w="120" w:type="dxa"/>
             </w:tcMar>
             <w:vAlign w:val="center"/>
-          </w:tcPr>
-          <w:p>
-            <w:pPr>
-              <w:pStyle w:val="MdTableCell"/>
-              <w:jc w:val="center"/>
-            </w:pPr>
-            <w:r>
-              <w:t>Config 4 (Low β1)</w:t>
-            </w:r>
-          </w:p>
-        </w:tc>
-        <w:tc>
-          <w:tcPr>
-            <w:tcW w:w="0" w:type="auto"/>
-            <w:tcBorders>
+            <w:hideMark/>
+          </w:tcPr>
+          <w:p>
+            <w:r>
+              <w:t>Config 4</w:t>
+            </w:r>
+          </w:p>
+        </w:tc>
+        <w:tc>
+          <w:tcPr>
+            <w:tcW w:w="0" w:type="auto"/>
+            <w:tcBorders>
+              <w:top w:val="single" w:sz="2" w:space="0" w:color="E1E4E8"/>
+              <w:left w:val="single" w:sz="2" w:space="0" w:color="F6F8FA"/>
               <w:bottom w:val="single" w:sz="4" w:space="0" w:color="E1E4E8"/>
+              <w:right w:val="single" w:sz="2" w:space="0" w:color="F6F8FA"/>
             </w:tcBorders>
             <w:tcMar>
               <w:top w:w="80" w:type="dxa"/>
@@ -1365,12 +1480,9 @@
               <w:right w:w="120" w:type="dxa"/>
             </w:tcMar>
             <w:vAlign w:val="center"/>
-          </w:tcPr>
-          <w:p>
-            <w:pPr>
-              <w:pStyle w:val="MdTableCell"/>
-              <w:jc w:val="center"/>
-            </w:pPr>
+            <w:hideMark/>
+          </w:tcPr>
+          <w:p>
             <w:r>
               <w:t>0.001</w:t>
             </w:r>
@@ -1380,7 +1492,10 @@
           <w:tcPr>
             <w:tcW w:w="0" w:type="auto"/>
             <w:tcBorders>
+              <w:top w:val="single" w:sz="2" w:space="0" w:color="E1E4E8"/>
+              <w:left w:val="single" w:sz="2" w:space="0" w:color="F6F8FA"/>
               <w:bottom w:val="single" w:sz="4" w:space="0" w:color="E1E4E8"/>
+              <w:right w:val="single" w:sz="2" w:space="0" w:color="F6F8FA"/>
             </w:tcBorders>
             <w:tcMar>
               <w:top w:w="80" w:type="dxa"/>
@@ -1389,12 +1504,9 @@
               <w:right w:w="120" w:type="dxa"/>
             </w:tcMar>
             <w:vAlign w:val="center"/>
-          </w:tcPr>
-          <w:p>
-            <w:pPr>
-              <w:pStyle w:val="MdTableCell"/>
-              <w:jc w:val="center"/>
-            </w:pPr>
+            <w:hideMark/>
+          </w:tcPr>
+          <w:p>
             <w:r>
               <w:t>0.8</w:t>
             </w:r>
@@ -1404,7 +1516,10 @@
           <w:tcPr>
             <w:tcW w:w="0" w:type="auto"/>
             <w:tcBorders>
+              <w:top w:val="single" w:sz="2" w:space="0" w:color="E1E4E8"/>
+              <w:left w:val="single" w:sz="2" w:space="0" w:color="F6F8FA"/>
               <w:bottom w:val="single" w:sz="4" w:space="0" w:color="E1E4E8"/>
+              <w:right w:val="single" w:sz="2" w:space="0" w:color="F6F8FA"/>
             </w:tcBorders>
             <w:tcMar>
               <w:top w:w="80" w:type="dxa"/>
@@ -1413,12 +1528,9 @@
               <w:right w:w="120" w:type="dxa"/>
             </w:tcMar>
             <w:vAlign w:val="center"/>
-          </w:tcPr>
-          <w:p>
-            <w:pPr>
-              <w:pStyle w:val="MdTableCell"/>
-              <w:jc w:val="center"/>
-            </w:pPr>
+            <w:hideMark/>
+          </w:tcPr>
+          <w:p>
             <w:r>
               <w:t>1e-2</w:t>
             </w:r>
@@ -1428,7 +1540,10 @@
           <w:tcPr>
             <w:tcW w:w="0" w:type="auto"/>
             <w:tcBorders>
+              <w:top w:val="single" w:sz="2" w:space="0" w:color="E1E4E8"/>
+              <w:left w:val="single" w:sz="2" w:space="0" w:color="F6F8FA"/>
               <w:bottom w:val="single" w:sz="4" w:space="0" w:color="E1E4E8"/>
+              <w:right w:val="nil"/>
             </w:tcBorders>
             <w:tcMar>
               <w:top w:w="80" w:type="dxa"/>
@@ -1437,74 +1552,69 @@
               <w:right w:w="120" w:type="dxa"/>
             </w:tcMar>
             <w:vAlign w:val="center"/>
-          </w:tcPr>
-          <w:p>
-            <w:pPr>
-              <w:pStyle w:val="MdTableCell"/>
-              <w:jc w:val="center"/>
-            </w:pPr>
-            <w:r>
-              <w:t>95.67%</w:t>
-            </w:r>
-          </w:p>
-        </w:tc>
-        <w:tc>
-          <w:tcPr>
-            <w:tcW w:w="0" w:type="auto"/>
-            <w:tcBorders>
-              <w:bottom w:val="single" w:sz="4" w:space="0" w:color="E1E4E8"/>
-            </w:tcBorders>
-            <w:tcMar>
-              <w:top w:w="80" w:type="dxa"/>
-              <w:left w:w="120" w:type="dxa"/>
-              <w:bottom w:w="80" w:type="dxa"/>
-              <w:right w:w="120" w:type="dxa"/>
-            </w:tcMar>
-            <w:vAlign w:val="center"/>
-          </w:tcPr>
-          <w:p>
-            <w:pPr>
-              <w:pStyle w:val="MdTableCell"/>
-              <w:jc w:val="center"/>
-            </w:pPr>
-            <w:r>
-              <w:t>—</w:t>
+            <w:hideMark/>
+          </w:tcPr>
+          <w:p>
+            <w:r>
+              <w:t>~95.6%</w:t>
             </w:r>
           </w:p>
         </w:tc>
       </w:tr>
     </w:tbl>
     <w:p>
-      <w:pPr>
-        <w:pStyle w:val="MdParagraph"/>
-      </w:pPr>
-      <w:r>
-        <w:rPr>
-          <w:rStyle w:val="MdStrong"/>
-        </w:rPr>
+      <w:r>
+        <w:rPr>
+          <w:i/>
+          <w:iCs/>
+        </w:rPr>
+        <w:t>*Config 2 achieved the highest cross-validation accuracy but showed a failure mode during final training (see Section 6.1). Config 1 was selected as the best stable configuration.</w:t>
+      </w:r>
+    </w:p>
+    <w:p/>
+    <w:p>
+      <w:r>
+        <w:rPr>
+          <w:b/>
+          <w:bCs/>
+        </w:rPr>
+        <w:lastRenderedPageBreak/>
         <w:t xml:space="preserve">Adam — Final Training Results (Best Configuration: </w:t>
       </w:r>
       <w:proofErr w:type="spellStart"/>
       <w:r>
         <w:rPr>
-          <w:rStyle w:val="MdStrong"/>
+          <w:b/>
+          <w:bCs/>
         </w:rPr>
         <w:t>lr</w:t>
       </w:r>
       <w:proofErr w:type="spellEnd"/>
       <w:r>
         <w:rPr>
-          <w:rStyle w:val="MdStrong"/>
-        </w:rPr>
-        <w:t>=0.01, β1=0.9):</w:t>
+          <w:b/>
+          <w:bCs/>
+        </w:rPr>
+        <w:t xml:space="preserve">=0.001, β1=0.9, </w:t>
+      </w:r>
+      <w:proofErr w:type="spellStart"/>
+      <w:r>
+        <w:rPr>
+          <w:b/>
+          <w:bCs/>
+        </w:rPr>
+        <w:t>weight_decay</w:t>
+      </w:r>
+      <w:proofErr w:type="spellEnd"/>
+      <w:r>
+        <w:rPr>
+          <w:b/>
+          <w:bCs/>
+        </w:rPr>
+        <w:t>=1e-4):</w:t>
       </w:r>
     </w:p>
-    <w:p>
-      <w:pPr>
-        <w:pStyle w:val="MdSpace"/>
-        <w:spacing w:after="60"/>
-      </w:pPr>
-    </w:p>
+    <w:p/>
     <w:tbl>
       <w:tblPr>
         <w:tblW w:w="5000" w:type="pct"/>
@@ -1518,11 +1628,11 @@
           <w:left w:w="10" w:type="dxa"/>
           <w:right w:w="10" w:type="dxa"/>
         </w:tblCellMar>
-        <w:tblLook w:val="0000" w:firstRow="0" w:lastRow="0" w:firstColumn="0" w:lastColumn="0" w:noHBand="0" w:noVBand="0"/>
+        <w:tblLook w:val="04A0" w:firstRow="1" w:lastRow="0" w:firstColumn="1" w:lastColumn="0" w:noHBand="0" w:noVBand="1"/>
       </w:tblPr>
       <w:tblGrid>
-        <w:gridCol w:w="5510"/>
-        <w:gridCol w:w="3516"/>
+        <w:gridCol w:w="5528"/>
+        <w:gridCol w:w="3498"/>
       </w:tblGrid>
       <w:tr>
         <w:trPr>
@@ -1533,6 +1643,12 @@
         <w:tc>
           <w:tcPr>
             <w:tcW w:w="0" w:type="auto"/>
+            <w:tcBorders>
+              <w:top w:val="single" w:sz="4" w:space="0" w:color="E1E4E8"/>
+              <w:left w:val="nil"/>
+              <w:bottom w:val="single" w:sz="2" w:space="0" w:color="E1E4E8"/>
+              <w:right w:val="single" w:sz="2" w:space="0" w:color="F6F8FA"/>
+            </w:tcBorders>
             <w:tcMar>
               <w:top w:w="100" w:type="dxa"/>
               <w:left w:w="120" w:type="dxa"/>
@@ -1540,12 +1656,20 @@
               <w:right w:w="120" w:type="dxa"/>
             </w:tcMar>
             <w:vAlign w:val="center"/>
+            <w:hideMark/>
           </w:tcPr>
           <w:p>
             <w:pPr>
-              <w:pStyle w:val="MdTableHeader"/>
+              <w:rPr>
+                <w:b/>
+                <w:bCs/>
+              </w:rPr>
             </w:pPr>
             <w:r>
+              <w:rPr>
+                <w:b/>
+                <w:bCs/>
+              </w:rPr>
               <w:t>Metric</w:t>
             </w:r>
           </w:p>
@@ -1553,6 +1677,12 @@
         <w:tc>
           <w:tcPr>
             <w:tcW w:w="0" w:type="auto"/>
+            <w:tcBorders>
+              <w:top w:val="single" w:sz="4" w:space="0" w:color="E1E4E8"/>
+              <w:left w:val="single" w:sz="2" w:space="0" w:color="F6F8FA"/>
+              <w:bottom w:val="single" w:sz="2" w:space="0" w:color="E1E4E8"/>
+              <w:right w:val="nil"/>
+            </w:tcBorders>
             <w:tcMar>
               <w:top w:w="100" w:type="dxa"/>
               <w:left w:w="120" w:type="dxa"/>
@@ -1560,12 +1690,20 @@
               <w:right w:w="120" w:type="dxa"/>
             </w:tcMar>
             <w:vAlign w:val="center"/>
+            <w:hideMark/>
           </w:tcPr>
           <w:p>
             <w:pPr>
-              <w:pStyle w:val="MdTableHeader"/>
+              <w:rPr>
+                <w:b/>
+                <w:bCs/>
+              </w:rPr>
             </w:pPr>
             <w:r>
+              <w:rPr>
+                <w:b/>
+                <w:bCs/>
+              </w:rPr>
               <w:t>Value</w:t>
             </w:r>
           </w:p>
@@ -1579,6 +1717,12 @@
         <w:tc>
           <w:tcPr>
             <w:tcW w:w="0" w:type="auto"/>
+            <w:tcBorders>
+              <w:top w:val="single" w:sz="2" w:space="0" w:color="E1E4E8"/>
+              <w:left w:val="nil"/>
+              <w:bottom w:val="single" w:sz="2" w:space="0" w:color="E1E4E8"/>
+              <w:right w:val="single" w:sz="2" w:space="0" w:color="F6F8FA"/>
+            </w:tcBorders>
             <w:tcMar>
               <w:top w:w="80" w:type="dxa"/>
               <w:left w:w="120" w:type="dxa"/>
@@ -1586,11 +1730,9 @@
               <w:right w:w="120" w:type="dxa"/>
             </w:tcMar>
             <w:vAlign w:val="center"/>
-          </w:tcPr>
-          <w:p>
-            <w:pPr>
-              <w:pStyle w:val="MdTableCell"/>
-            </w:pPr>
+            <w:hideMark/>
+          </w:tcPr>
+          <w:p>
             <w:r>
               <w:t>Training Accuracy (final epoch)</w:t>
             </w:r>
@@ -1599,6 +1741,12 @@
         <w:tc>
           <w:tcPr>
             <w:tcW w:w="0" w:type="auto"/>
+            <w:tcBorders>
+              <w:top w:val="single" w:sz="2" w:space="0" w:color="E1E4E8"/>
+              <w:left w:val="single" w:sz="2" w:space="0" w:color="F6F8FA"/>
+              <w:bottom w:val="single" w:sz="2" w:space="0" w:color="E1E4E8"/>
+              <w:right w:val="nil"/>
+            </w:tcBorders>
             <w:tcMar>
               <w:top w:w="80" w:type="dxa"/>
               <w:left w:w="120" w:type="dxa"/>
@@ -1606,11 +1754,9 @@
               <w:right w:w="120" w:type="dxa"/>
             </w:tcMar>
             <w:vAlign w:val="center"/>
-          </w:tcPr>
-          <w:p>
-            <w:pPr>
-              <w:pStyle w:val="MdTableCell"/>
-            </w:pPr>
+            <w:hideMark/>
+          </w:tcPr>
+          <w:p>
             <w:r>
               <w:t>95.26%</w:t>
             </w:r>
@@ -1625,6 +1771,12 @@
         <w:tc>
           <w:tcPr>
             <w:tcW w:w="0" w:type="auto"/>
+            <w:tcBorders>
+              <w:top w:val="single" w:sz="2" w:space="0" w:color="E1E4E8"/>
+              <w:left w:val="nil"/>
+              <w:bottom w:val="single" w:sz="2" w:space="0" w:color="E1E4E8"/>
+              <w:right w:val="single" w:sz="2" w:space="0" w:color="F6F8FA"/>
+            </w:tcBorders>
             <w:tcMar>
               <w:top w:w="80" w:type="dxa"/>
               <w:left w:w="120" w:type="dxa"/>
@@ -1632,11 +1784,9 @@
               <w:right w:w="120" w:type="dxa"/>
             </w:tcMar>
             <w:vAlign w:val="center"/>
-          </w:tcPr>
-          <w:p>
-            <w:pPr>
-              <w:pStyle w:val="MdTableCell"/>
-            </w:pPr>
+            <w:hideMark/>
+          </w:tcPr>
+          <w:p>
             <w:r>
               <w:t>Best Test Accuracy</w:t>
             </w:r>
@@ -1645,6 +1795,12 @@
         <w:tc>
           <w:tcPr>
             <w:tcW w:w="0" w:type="auto"/>
+            <w:tcBorders>
+              <w:top w:val="single" w:sz="2" w:space="0" w:color="E1E4E8"/>
+              <w:left w:val="single" w:sz="2" w:space="0" w:color="F6F8FA"/>
+              <w:bottom w:val="single" w:sz="2" w:space="0" w:color="E1E4E8"/>
+              <w:right w:val="nil"/>
+            </w:tcBorders>
             <w:tcMar>
               <w:top w:w="80" w:type="dxa"/>
               <w:left w:w="120" w:type="dxa"/>
@@ -1652,11 +1808,9 @@
               <w:right w:w="120" w:type="dxa"/>
             </w:tcMar>
             <w:vAlign w:val="center"/>
-          </w:tcPr>
-          <w:p>
-            <w:pPr>
-              <w:pStyle w:val="MdTableCell"/>
-            </w:pPr>
+            <w:hideMark/>
+          </w:tcPr>
+          <w:p>
             <w:r>
               <w:t>89.91% (Epoch 16)</w:t>
             </w:r>
@@ -1671,6 +1825,12 @@
         <w:tc>
           <w:tcPr>
             <w:tcW w:w="0" w:type="auto"/>
+            <w:tcBorders>
+              <w:top w:val="single" w:sz="2" w:space="0" w:color="E1E4E8"/>
+              <w:left w:val="nil"/>
+              <w:bottom w:val="single" w:sz="2" w:space="0" w:color="E1E4E8"/>
+              <w:right w:val="single" w:sz="2" w:space="0" w:color="F6F8FA"/>
+            </w:tcBorders>
             <w:tcMar>
               <w:top w:w="80" w:type="dxa"/>
               <w:left w:w="120" w:type="dxa"/>
@@ -1678,11 +1838,9 @@
               <w:right w:w="120" w:type="dxa"/>
             </w:tcMar>
             <w:vAlign w:val="center"/>
-          </w:tcPr>
-          <w:p>
-            <w:pPr>
-              <w:pStyle w:val="MdTableCell"/>
-            </w:pPr>
+            <w:hideMark/>
+          </w:tcPr>
+          <w:p>
             <w:r>
               <w:t>Final Test Loss</w:t>
             </w:r>
@@ -1691,6 +1849,12 @@
         <w:tc>
           <w:tcPr>
             <w:tcW w:w="0" w:type="auto"/>
+            <w:tcBorders>
+              <w:top w:val="single" w:sz="2" w:space="0" w:color="E1E4E8"/>
+              <w:left w:val="single" w:sz="2" w:space="0" w:color="F6F8FA"/>
+              <w:bottom w:val="single" w:sz="2" w:space="0" w:color="E1E4E8"/>
+              <w:right w:val="nil"/>
+            </w:tcBorders>
             <w:tcMar>
               <w:top w:w="80" w:type="dxa"/>
               <w:left w:w="120" w:type="dxa"/>
@@ -1698,11 +1862,9 @@
               <w:right w:w="120" w:type="dxa"/>
             </w:tcMar>
             <w:vAlign w:val="center"/>
-          </w:tcPr>
-          <w:p>
-            <w:pPr>
-              <w:pStyle w:val="MdTableCell"/>
-            </w:pPr>
+            <w:hideMark/>
+          </w:tcPr>
+          <w:p>
             <w:r>
               <w:t>0.3844</w:t>
             </w:r>
@@ -1717,6 +1879,12 @@
         <w:tc>
           <w:tcPr>
             <w:tcW w:w="0" w:type="auto"/>
+            <w:tcBorders>
+              <w:top w:val="single" w:sz="2" w:space="0" w:color="E1E4E8"/>
+              <w:left w:val="nil"/>
+              <w:bottom w:val="single" w:sz="2" w:space="0" w:color="E1E4E8"/>
+              <w:right w:val="single" w:sz="2" w:space="0" w:color="F6F8FA"/>
+            </w:tcBorders>
             <w:tcMar>
               <w:top w:w="80" w:type="dxa"/>
               <w:left w:w="120" w:type="dxa"/>
@@ -1724,11 +1892,9 @@
               <w:right w:w="120" w:type="dxa"/>
             </w:tcMar>
             <w:vAlign w:val="center"/>
-          </w:tcPr>
-          <w:p>
-            <w:pPr>
-              <w:pStyle w:val="MdTableCell"/>
-            </w:pPr>
+            <w:hideMark/>
+          </w:tcPr>
+          <w:p>
             <w:r>
               <w:t>Generalization Gap</w:t>
             </w:r>
@@ -1737,6 +1903,12 @@
         <w:tc>
           <w:tcPr>
             <w:tcW w:w="0" w:type="auto"/>
+            <w:tcBorders>
+              <w:top w:val="single" w:sz="2" w:space="0" w:color="E1E4E8"/>
+              <w:left w:val="single" w:sz="2" w:space="0" w:color="F6F8FA"/>
+              <w:bottom w:val="single" w:sz="2" w:space="0" w:color="E1E4E8"/>
+              <w:right w:val="nil"/>
+            </w:tcBorders>
             <w:tcMar>
               <w:top w:w="80" w:type="dxa"/>
               <w:left w:w="120" w:type="dxa"/>
@@ -1744,11 +1916,9 @@
               <w:right w:w="120" w:type="dxa"/>
             </w:tcMar>
             <w:vAlign w:val="center"/>
-          </w:tcPr>
-          <w:p>
-            <w:pPr>
-              <w:pStyle w:val="MdTableCell"/>
-            </w:pPr>
+            <w:hideMark/>
+          </w:tcPr>
+          <w:p>
             <w:r>
               <w:t>~5.35%</w:t>
             </w:r>
@@ -1764,7 +1934,10 @@
           <w:tcPr>
             <w:tcW w:w="0" w:type="auto"/>
             <w:tcBorders>
+              <w:top w:val="single" w:sz="2" w:space="0" w:color="E1E4E8"/>
+              <w:left w:val="nil"/>
               <w:bottom w:val="single" w:sz="4" w:space="0" w:color="E1E4E8"/>
+              <w:right w:val="single" w:sz="2" w:space="0" w:color="F6F8FA"/>
             </w:tcBorders>
             <w:tcMar>
               <w:top w:w="80" w:type="dxa"/>
@@ -1773,11 +1946,9 @@
               <w:right w:w="120" w:type="dxa"/>
             </w:tcMar>
             <w:vAlign w:val="center"/>
-          </w:tcPr>
-          <w:p>
-            <w:pPr>
-              <w:pStyle w:val="MdTableCell"/>
-            </w:pPr>
+            <w:hideMark/>
+          </w:tcPr>
+          <w:p>
             <w:r>
               <w:t>Training Time per Fold (GPU)</w:t>
             </w:r>
@@ -1787,7 +1958,10 @@
           <w:tcPr>
             <w:tcW w:w="0" w:type="auto"/>
             <w:tcBorders>
+              <w:top w:val="single" w:sz="2" w:space="0" w:color="E1E4E8"/>
+              <w:left w:val="single" w:sz="2" w:space="0" w:color="F6F8FA"/>
               <w:bottom w:val="single" w:sz="4" w:space="0" w:color="E1E4E8"/>
+              <w:right w:val="nil"/>
             </w:tcBorders>
             <w:tcMar>
               <w:top w:w="80" w:type="dxa"/>
@@ -1796,11 +1970,9 @@
               <w:right w:w="120" w:type="dxa"/>
             </w:tcMar>
             <w:vAlign w:val="center"/>
-          </w:tcPr>
-          <w:p>
-            <w:pPr>
-              <w:pStyle w:val="MdTableCell"/>
-            </w:pPr>
+            <w:hideMark/>
+          </w:tcPr>
+          <w:p>
             <w:r>
               <w:t>~3–5 minutes</w:t>
             </w:r>
@@ -1810,25 +1982,25 @@
     </w:tbl>
     <w:p>
       <w:pPr>
-        <w:pStyle w:val="MdHeading3"/>
-      </w:pPr>
-      <w:r>
+        <w:rPr>
+          <w:b/>
+          <w:bCs/>
+        </w:rPr>
+      </w:pPr>
+      <w:r>
+        <w:rPr>
+          <w:b/>
+          <w:bCs/>
+        </w:rPr>
         <w:t>5.2 Required Plots</w:t>
       </w:r>
     </w:p>
+    <w:p/>
     <w:p>
-      <w:pPr>
-        <w:pStyle w:val="MdSpace"/>
-        <w:spacing w:after="60"/>
-      </w:pPr>
-    </w:p>
-    <w:p>
-      <w:pPr>
-        <w:pStyle w:val="MdParagraph"/>
-      </w:pPr>
-      <w:r>
-        <w:rPr>
-          <w:rStyle w:val="MdEm"/>
+      <w:r>
+        <w:rPr>
+          <w:i/>
+          <w:iCs/>
         </w:rPr>
         <w:t xml:space="preserve">Adam-specific plots are available in </w:t>
       </w:r>
@@ -1862,7 +2034,8 @@
       <w:proofErr w:type="spellEnd"/>
       <w:r>
         <w:rPr>
-          <w:rStyle w:val="MdEm"/>
+          <w:i/>
+          <w:iCs/>
         </w:rPr>
         <w:t xml:space="preserve"> in the </w:t>
       </w:r>
@@ -1886,440 +2059,337 @@
       </w:r>
       <w:r>
         <w:rPr>
-          <w:rStyle w:val="MdEm"/>
+          <w:i/>
+          <w:iCs/>
         </w:rPr>
         <w:t xml:space="preserve"> branch.</w:t>
+      </w:r>
+    </w:p>
+    <w:p/>
+    <w:p/>
+    <w:p/>
+    <w:p>
+      <w:pPr>
+        <w:rPr>
+          <w:b/>
+          <w:bCs/>
+        </w:rPr>
+      </w:pPr>
+      <w:r>
+        <w:rPr>
+          <w:b/>
+          <w:bCs/>
+        </w:rPr>
+        <w:t>6. Interpretation, Discussion, and Conclusion</w:t>
       </w:r>
     </w:p>
     <w:p>
       <w:pPr>
-        <w:pStyle w:val="MdSpace"/>
-        <w:spacing w:after="60"/>
-      </w:pPr>
+        <w:rPr>
+          <w:b/>
+          <w:bCs/>
+        </w:rPr>
+      </w:pPr>
+      <w:r>
+        <w:rPr>
+          <w:b/>
+          <w:bCs/>
+        </w:rPr>
+        <w:t>6.1 Optimizer Analysis</w:t>
+      </w:r>
     </w:p>
     <w:p>
-      <w:pPr>
-        <w:pStyle w:val="MdHr"/>
-        <w:pBdr>
-          <w:bottom w:val="single" w:sz="6" w:space="1" w:color="auto"/>
-        </w:pBdr>
-      </w:pPr>
+      <w:r>
+        <w:rPr>
+          <w:b/>
+          <w:bCs/>
+        </w:rPr>
+        <w:t>Adam — Convergence Behaviour and Sensitivity (Thiago Segantini):</w:t>
+      </w:r>
+    </w:p>
+    <w:p/>
+    <w:p>
+      <w:r>
+        <w:t xml:space="preserve">Adam demonstrated steady and consistent convergence on the KMNIST dataset. The optimizer was notably sensitive to the choice of learning rate. The higher learning rate configuration (Config 2, </w:t>
+      </w:r>
+      <w:proofErr w:type="spellStart"/>
+      <w:r>
+        <w:rPr>
+          <w:u w:val="single"/>
+        </w:rPr>
+        <w:t>lr</w:t>
+      </w:r>
+      <w:proofErr w:type="spellEnd"/>
+      <w:r>
+        <w:rPr>
+          <w:u w:val="single"/>
+        </w:rPr>
+        <w:t>=0.01</w:t>
+      </w:r>
+      <w:r>
+        <w:t xml:space="preserve">) achieved the highest cross-validation accuracy (95.68%) and converged significantly faster, starting with a training accuracy of approximately 84% at Epoch 1 compared to approximately 80% for the default configuration. In contrast, the lower learning rate (Config 3, </w:t>
+      </w:r>
+      <w:proofErr w:type="spellStart"/>
+      <w:r>
+        <w:rPr>
+          <w:u w:val="single"/>
+        </w:rPr>
+        <w:t>lr</w:t>
+      </w:r>
+      <w:proofErr w:type="spellEnd"/>
+      <w:r>
+        <w:rPr>
+          <w:u w:val="single"/>
+        </w:rPr>
+        <w:t>=0.0001</w:t>
+      </w:r>
+      <w:r>
+        <w:t>) performed the worst (94.15%), starting at only ~58% training accuracy at Epoch 1 — clearly insufficient to converge within the 20-epoch limit.</w:t>
+      </w:r>
+    </w:p>
+    <w:p/>
+    <w:p>
+      <w:r>
+        <w:t>An important failure mode was identified when combining a high learning rate (</w:t>
+      </w:r>
+      <w:proofErr w:type="spellStart"/>
+      <w:r>
+        <w:rPr>
+          <w:u w:val="single"/>
+        </w:rPr>
+        <w:t>lr</w:t>
+      </w:r>
+      <w:proofErr w:type="spellEnd"/>
+      <w:r>
+        <w:rPr>
+          <w:u w:val="single"/>
+        </w:rPr>
+        <w:t>=0.01</w:t>
+      </w:r>
+      <w:r>
+        <w:t>) with aggressive weight decay (</w:t>
+      </w:r>
+      <w:proofErr w:type="spellStart"/>
+      <w:r>
+        <w:rPr>
+          <w:u w:val="single"/>
+        </w:rPr>
+        <w:t>weight_decay</w:t>
+      </w:r>
+      <w:proofErr w:type="spellEnd"/>
+      <w:r>
+        <w:rPr>
+          <w:u w:val="single"/>
+        </w:rPr>
+        <w:t>=1e-3</w:t>
+      </w:r>
+      <w:r>
+        <w:t>): training accuracy stagnated at approximately 83% throughout all 20 epochs. This destructive interaction occurs because the optimizer takes large gradient steps while the weight decay simultaneously penalizes those weights, preventing the model from converging. As a result, despite Config 2 achieving the highest cross-validation accuracy, Config 1 (</w:t>
+      </w:r>
+      <w:proofErr w:type="spellStart"/>
+      <w:r>
+        <w:rPr>
+          <w:u w:val="single"/>
+        </w:rPr>
+        <w:t>lr</w:t>
+      </w:r>
+      <w:proofErr w:type="spellEnd"/>
+      <w:r>
+        <w:rPr>
+          <w:u w:val="single"/>
+        </w:rPr>
+        <w:t xml:space="preserve">=0.001, </w:t>
+      </w:r>
+      <w:proofErr w:type="spellStart"/>
+      <w:r>
+        <w:rPr>
+          <w:u w:val="single"/>
+        </w:rPr>
+        <w:t>weight_decay</w:t>
+      </w:r>
+      <w:proofErr w:type="spellEnd"/>
+      <w:r>
+        <w:rPr>
+          <w:u w:val="single"/>
+        </w:rPr>
+        <w:t>=1e-4</w:t>
+      </w:r>
+      <w:r>
+        <w:t>) was selected as the best stable configuration.</w:t>
+      </w:r>
+    </w:p>
+    <w:p/>
+    <w:p>
+      <w:r>
+        <w:t xml:space="preserve">Reducing the momentum parameter </w:t>
+      </w:r>
+      <w:r>
+        <w:rPr>
+          <w:u w:val="single"/>
+        </w:rPr>
+        <w:t>β1</w:t>
+      </w:r>
+      <w:r>
+        <w:t xml:space="preserve"> from 0.9 to 0.8 (Config 4) produced results virtually identical to the default (95.61%), suggesting that the first-moment decay rate is not a critical factor for this dataset and architecture.</w:t>
+      </w:r>
+    </w:p>
+    <w:p/>
+    <w:p>
+      <w:r>
+        <w:t>Using the best configuration (</w:t>
+      </w:r>
+      <w:proofErr w:type="spellStart"/>
+      <w:r>
+        <w:rPr>
+          <w:u w:val="single"/>
+        </w:rPr>
+        <w:t>lr</w:t>
+      </w:r>
+      <w:proofErr w:type="spellEnd"/>
+      <w:r>
+        <w:rPr>
+          <w:u w:val="single"/>
+        </w:rPr>
+        <w:t>=0.001</w:t>
+      </w:r>
+      <w:r>
+        <w:t xml:space="preserve">, </w:t>
+      </w:r>
+      <w:r>
+        <w:rPr>
+          <w:u w:val="single"/>
+        </w:rPr>
+        <w:t>β1=0.9</w:t>
+      </w:r>
+      <w:r>
+        <w:t xml:space="preserve">, </w:t>
+      </w:r>
+      <w:proofErr w:type="spellStart"/>
+      <w:r>
+        <w:rPr>
+          <w:u w:val="single"/>
+        </w:rPr>
+        <w:t>weight_decay</w:t>
+      </w:r>
+      <w:proofErr w:type="spellEnd"/>
+      <w:r>
+        <w:rPr>
+          <w:u w:val="single"/>
+        </w:rPr>
+        <w:t>=1e-4</w:t>
+      </w:r>
+      <w:r>
+        <w:t xml:space="preserve">), the final model achieved a best test accuracy of </w:t>
+      </w:r>
+      <w:r>
+        <w:rPr>
+          <w:b/>
+          <w:bCs/>
+        </w:rPr>
+        <w:t>89.91%</w:t>
+      </w:r>
+      <w:r>
+        <w:t xml:space="preserve"> with a generalization gap of approximately 5.35%, indicating moderate overfitting consistent with the absence of explicit regularization techniques such as Dropout.</w:t>
+      </w:r>
+    </w:p>
+    <w:p/>
+    <w:p>
+      <w:pPr>
+        <w:rPr>
+          <w:b/>
+          <w:bCs/>
+        </w:rPr>
+      </w:pPr>
+      <w:r>
+        <w:rPr>
+          <w:b/>
+          <w:bCs/>
+        </w:rPr>
+        <w:t>6.2 Weight Decay and Regularization</w:t>
+      </w:r>
+    </w:p>
+    <w:p/>
+    <w:p>
+      <w:pPr>
+        <w:rPr>
+          <w:b/>
+          <w:bCs/>
+        </w:rPr>
+      </w:pPr>
+      <w:r>
+        <w:rPr>
+          <w:b/>
+          <w:bCs/>
+        </w:rPr>
+        <w:t>6.3 Conclusion and Recommendation</w:t>
+      </w:r>
+    </w:p>
+    <w:p/>
+    <w:p/>
+    <w:p/>
+    <w:p>
+      <w:pPr>
+        <w:rPr>
+          <w:b/>
+          <w:bCs/>
+        </w:rPr>
+      </w:pPr>
+      <w:r>
+        <w:rPr>
+          <w:b/>
+          <w:bCs/>
+        </w:rPr>
+        <w:t>7. Individual Contribution Statements</w:t>
+      </w:r>
     </w:p>
     <w:p>
-      <w:pPr>
-        <w:pStyle w:val="MdSpace"/>
-        <w:spacing w:after="60"/>
-      </w:pPr>
+      <w:r>
+        <w:rPr>
+          <w:b/>
+          <w:bCs/>
+        </w:rPr>
+        <w:t>Thiago Segantini Nogueira:</w:t>
+      </w:r>
+      <w:r>
+        <w:t xml:space="preserve"> I was responsible for the systematic investigation of the Adam optimizer. I implemented the hyperparameter search strategy, testing four distinct configurations across 5-fold cross-validation on the KMNIST dataset. I investigated the effect of learning rate, momentum (</w:t>
+      </w:r>
+      <w:r>
+        <w:rPr>
+          <w:u w:val="single"/>
+        </w:rPr>
+        <w:t>β1</w:t>
+      </w:r>
+      <w:r>
+        <w:t>), and weight decay on convergence speed and final accuracy. I identified a specific failure mode when combining high learning rates with aggressive weight decay, and selected the best stable configuration based on both cross-validation and final training results. I also authored the theoretical background, methodology, and discussion sections for Adam in this report.</w:t>
+      </w:r>
+    </w:p>
+    <w:p/>
+    <w:p/>
+    <w:p/>
+    <w:p/>
+    <w:p>
+      <w:pPr>
+        <w:rPr>
+          <w:b/>
+          <w:bCs/>
+        </w:rPr>
+      </w:pPr>
+      <w:r>
+        <w:rPr>
+          <w:b/>
+          <w:bCs/>
+        </w:rPr>
+        <w:t>8. References</w:t>
+      </w:r>
     </w:p>
     <w:p>
-      <w:pPr>
-        <w:pStyle w:val="MdHeading2"/>
-      </w:pPr>
-      <w:r>
-        <w:lastRenderedPageBreak/>
-        <w:t>6. Interpretation, Discussion, and Conclusion</w:t>
-      </w:r>
-    </w:p>
-    <w:p>
-      <w:pPr>
-        <w:pStyle w:val="MdHeading3"/>
-      </w:pPr>
-      <w:r>
-        <w:t>6.1 Optimizer Analysis</w:t>
-      </w:r>
-    </w:p>
-    <w:p>
-      <w:pPr>
-        <w:pStyle w:val="MdParagraph"/>
-      </w:pPr>
-      <w:r>
-        <w:rPr>
-          <w:rStyle w:val="MdStrong"/>
-        </w:rPr>
-        <w:t>Adam — Convergence Behaviour and Sensitivity (Thiago Segantini):</w:t>
-      </w:r>
-    </w:p>
-    <w:p>
-      <w:pPr>
-        <w:pStyle w:val="MdSpace"/>
-        <w:spacing w:after="60"/>
-      </w:pPr>
-    </w:p>
-    <w:p>
-      <w:pPr>
-        <w:pStyle w:val="MdParagraph"/>
-      </w:pPr>
-      <w:r>
-        <w:t xml:space="preserve">Adam demonstrated steady and consistent convergence on the KMNIST dataset. The optimizer was notably sensitive to the choice of learning rate. The higher learning rate configuration (Config 2, </w:t>
-      </w:r>
-      <w:proofErr w:type="spellStart"/>
-      <w:r>
-        <w:rPr>
-          <w:u w:val="single"/>
-        </w:rPr>
-        <w:t>lr</w:t>
-      </w:r>
-      <w:proofErr w:type="spellEnd"/>
-      <w:r>
-        <w:rPr>
-          <w:u w:val="single"/>
-        </w:rPr>
-        <w:t>=0.01</w:t>
-      </w:r>
-      <w:r>
-        <w:t xml:space="preserve">) achieved the best result (95.68% mean validation accuracy) and converged significantly faster, starting with a training accuracy of approximately 84% at Epoch 1 compared to approximately 80% for the default configuration. In contrast, the lower learning rate (Config 3, </w:t>
-      </w:r>
-      <w:proofErr w:type="spellStart"/>
-      <w:r>
-        <w:rPr>
-          <w:u w:val="single"/>
-        </w:rPr>
-        <w:t>lr</w:t>
-      </w:r>
-      <w:proofErr w:type="spellEnd"/>
-      <w:r>
-        <w:rPr>
-          <w:u w:val="single"/>
-        </w:rPr>
-        <w:t>=0.0001</w:t>
-      </w:r>
-      <w:r>
-        <w:t>) performed the worst (94.15%), starting at only ~58% training accuracy at Epoch 1 — clearly insufficient to converge within the 20-epoch limit.</w:t>
-      </w:r>
-    </w:p>
-    <w:p>
-      <w:pPr>
-        <w:pStyle w:val="MdSpace"/>
-        <w:spacing w:after="60"/>
-      </w:pPr>
-    </w:p>
-    <w:p>
-      <w:pPr>
-        <w:pStyle w:val="MdParagraph"/>
-      </w:pPr>
-      <w:r>
-        <w:t xml:space="preserve">Reducing the momentum parameter </w:t>
-      </w:r>
-      <w:r>
-        <w:rPr>
-          <w:u w:val="single"/>
-        </w:rPr>
-        <w:t>β1</w:t>
-      </w:r>
-      <w:r>
-        <w:t xml:space="preserve"> from 0.9 to 0.8 (Config 4) produced results virtually identical to the default (95.67% vs. 95.58%), suggesting that the first-moment decay rate is not a critical factor for this dataset and architecture.</w:t>
-      </w:r>
-    </w:p>
-    <w:p>
-      <w:pPr>
-        <w:pStyle w:val="MdSpace"/>
-        <w:spacing w:after="60"/>
-      </w:pPr>
-    </w:p>
-    <w:p>
-      <w:pPr>
-        <w:pStyle w:val="MdParagraph"/>
-      </w:pPr>
-      <w:r>
-        <w:t>An important failure mode was identified when combining a high learning rate (</w:t>
-      </w:r>
-      <w:proofErr w:type="spellStart"/>
-      <w:r>
-        <w:rPr>
-          <w:u w:val="single"/>
-        </w:rPr>
-        <w:t>lr</w:t>
-      </w:r>
-      <w:proofErr w:type="spellEnd"/>
-      <w:r>
-        <w:rPr>
-          <w:u w:val="single"/>
-        </w:rPr>
-        <w:t>=0.01</w:t>
-      </w:r>
-      <w:r>
-        <w:t>) with aggressive weight decay (</w:t>
-      </w:r>
-      <w:proofErr w:type="spellStart"/>
-      <w:r>
-        <w:rPr>
-          <w:u w:val="single"/>
-        </w:rPr>
-        <w:t>weight_decay</w:t>
-      </w:r>
-      <w:proofErr w:type="spellEnd"/>
-      <w:r>
-        <w:rPr>
-          <w:u w:val="single"/>
-        </w:rPr>
-        <w:t>=1e-3</w:t>
-      </w:r>
-      <w:r>
-        <w:t>): training accuracy stagnated at approximately 83% throughout all 20 epochs. This destructive interaction occurs because the optimizer takes large gradient steps while the weight decay simultaneously penalizes those weights, preventing the model from converging.</w:t>
-      </w:r>
-    </w:p>
-    <w:p>
-      <w:pPr>
-        <w:pStyle w:val="MdSpace"/>
-        <w:spacing w:after="60"/>
-      </w:pPr>
-    </w:p>
-    <w:p>
-      <w:pPr>
-        <w:pStyle w:val="MdParagraph"/>
-      </w:pPr>
-      <w:r>
-        <w:t>Using the best configuration (</w:t>
-      </w:r>
-      <w:proofErr w:type="spellStart"/>
-      <w:r>
-        <w:rPr>
-          <w:u w:val="single"/>
-        </w:rPr>
-        <w:t>lr</w:t>
-      </w:r>
-      <w:proofErr w:type="spellEnd"/>
-      <w:r>
-        <w:rPr>
-          <w:u w:val="single"/>
-        </w:rPr>
-        <w:t>=0.01</w:t>
-      </w:r>
-      <w:r>
-        <w:t xml:space="preserve">, </w:t>
-      </w:r>
-      <w:r>
-        <w:rPr>
-          <w:u w:val="single"/>
-        </w:rPr>
-        <w:t>β1=0.9</w:t>
-      </w:r>
-      <w:r>
-        <w:t xml:space="preserve">), the final model achieved a best test accuracy of </w:t>
-      </w:r>
-      <w:r>
-        <w:rPr>
-          <w:rStyle w:val="MdStrong"/>
-        </w:rPr>
-        <w:t>89.91%</w:t>
-      </w:r>
-      <w:r>
-        <w:t xml:space="preserve"> with a generalization gap of approximately 5.35%, indicating moderate overfitting consistent with the absence of explicit regularization such as Dropout.</w:t>
-      </w:r>
-    </w:p>
-    <w:p>
-      <w:pPr>
-        <w:pStyle w:val="MdSpace"/>
-        <w:spacing w:after="60"/>
-      </w:pPr>
-    </w:p>
-    <w:p>
-      <w:pPr>
-        <w:pStyle w:val="MdHeading3"/>
-      </w:pPr>
-      <w:r>
-        <w:t>6.2 Weight Decay and Regularization</w:t>
-      </w:r>
-    </w:p>
-    <w:p>
-      <w:pPr>
-        <w:pStyle w:val="MdSpace"/>
-        <w:spacing w:after="60"/>
-      </w:pPr>
-    </w:p>
-    <w:p>
-      <w:pPr>
-        <w:pStyle w:val="MdHeading3"/>
-      </w:pPr>
-      <w:r>
-        <w:t>6.3 Conclusion and Recommendation</w:t>
-      </w:r>
-    </w:p>
-    <w:p>
-      <w:pPr>
-        <w:pStyle w:val="MdSpace"/>
-        <w:spacing w:after="60"/>
-      </w:pPr>
-    </w:p>
-    <w:p>
-      <w:pPr>
-        <w:pStyle w:val="MdHr"/>
-        <w:pBdr>
-          <w:bottom w:val="single" w:sz="6" w:space="1" w:color="auto"/>
-        </w:pBdr>
-      </w:pPr>
-    </w:p>
-    <w:p>
-      <w:pPr>
-        <w:pStyle w:val="MdSpace"/>
-        <w:spacing w:after="60"/>
-      </w:pPr>
-    </w:p>
-    <w:p>
-      <w:pPr>
-        <w:pStyle w:val="MdHeading2"/>
-      </w:pPr>
-      <w:r>
-        <w:t>7. Individual Contribution Statements</w:t>
-      </w:r>
-    </w:p>
-    <w:p>
-      <w:pPr>
-        <w:pStyle w:val="MdParagraph"/>
-      </w:pPr>
-      <w:r>
-        <w:rPr>
-          <w:rStyle w:val="MdStrong"/>
-        </w:rPr>
-        <w:t>Thiago Segantini Nogueira:</w:t>
-      </w:r>
-      <w:r>
-        <w:t xml:space="preserve"> I was responsible for the systematic investigation of the Adam optimizer. I implemented the hyperparameter search strategy, testing four distinct configurations across 5-fold cross-validation on the KMNIST dataset. I analyzed the convergence behavior, evaluating the sensitivity of Adam to changes in learning rate, momentum (</w:t>
-      </w:r>
-      <w:r>
-        <w:rPr>
-          <w:u w:val="single"/>
-        </w:rPr>
-        <w:t>β1</w:t>
-      </w:r>
-      <w:r>
-        <w:t>), and weight decay. I identified a specific failure mode when combining high learning rates with aggressive weight decay. I also authored the theoretical background, methodology, and discussion sections for Adam in this report.</w:t>
-      </w:r>
-    </w:p>
-    <w:p>
-      <w:pPr>
-        <w:pStyle w:val="MdSpace"/>
-        <w:spacing w:after="60"/>
-      </w:pPr>
-    </w:p>
-    <w:p>
-      <w:pPr>
-        <w:pStyle w:val="MdParagraph"/>
-      </w:pPr>
-      <w:r>
-        <w:rPr>
-          <w:rStyle w:val="MdEm"/>
-        </w:rPr>
-        <w:t>[Kevin Joseff Cabrera — To be completed]</w:t>
-      </w:r>
-    </w:p>
-    <w:p>
-      <w:pPr>
-        <w:pStyle w:val="MdSpace"/>
-        <w:spacing w:after="60"/>
-      </w:pPr>
-    </w:p>
-    <w:p>
-      <w:pPr>
-        <w:pStyle w:val="MdParagraph"/>
-      </w:pPr>
-      <w:r>
-        <w:rPr>
-          <w:rStyle w:val="MdEm"/>
-        </w:rPr>
-        <w:t>[Mohd Mujtaba Saighani — To be completed]</w:t>
-      </w:r>
-    </w:p>
-    <w:p>
-      <w:pPr>
-        <w:pStyle w:val="MdSpace"/>
-        <w:spacing w:after="60"/>
-      </w:pPr>
-    </w:p>
-    <w:p>
-      <w:pPr>
-        <w:pStyle w:val="MdParagraph"/>
-      </w:pPr>
-      <w:r>
-        <w:rPr>
-          <w:rStyle w:val="MdEm"/>
-        </w:rPr>
-        <w:t>[</w:t>
-      </w:r>
-      <w:proofErr w:type="spellStart"/>
-      <w:r>
-        <w:rPr>
-          <w:rStyle w:val="MdEm"/>
-        </w:rPr>
-        <w:t>Sayamon</w:t>
-      </w:r>
-      <w:proofErr w:type="spellEnd"/>
-      <w:r>
-        <w:rPr>
-          <w:rStyle w:val="MdEm"/>
-        </w:rPr>
-        <w:t xml:space="preserve"> </w:t>
-      </w:r>
-      <w:proofErr w:type="spellStart"/>
-      <w:r>
-        <w:rPr>
-          <w:rStyle w:val="MdEm"/>
-        </w:rPr>
-        <w:t>Sittiprom</w:t>
-      </w:r>
-      <w:proofErr w:type="spellEnd"/>
-      <w:r>
-        <w:rPr>
-          <w:rStyle w:val="MdEm"/>
-        </w:rPr>
-        <w:t xml:space="preserve"> — To be completed]</w:t>
-      </w:r>
-    </w:p>
-    <w:p>
-      <w:pPr>
-        <w:pStyle w:val="MdSpace"/>
-        <w:spacing w:after="60"/>
-      </w:pPr>
-    </w:p>
-    <w:p>
-      <w:pPr>
-        <w:pStyle w:val="MdParagraph"/>
-      </w:pPr>
-      <w:r>
-        <w:rPr>
-          <w:rStyle w:val="MdEm"/>
-        </w:rPr>
-        <w:t>[Yao-Fu Yang — To be completed]</w:t>
-      </w:r>
-    </w:p>
-    <w:p>
-      <w:pPr>
-        <w:pStyle w:val="MdSpace"/>
-        <w:spacing w:after="60"/>
-      </w:pPr>
-    </w:p>
-    <w:p>
-      <w:pPr>
-        <w:pStyle w:val="MdHr"/>
-        <w:pBdr>
-          <w:bottom w:val="single" w:sz="6" w:space="1" w:color="auto"/>
-        </w:pBdr>
-      </w:pPr>
-    </w:p>
-    <w:p>
-      <w:pPr>
-        <w:pStyle w:val="MdSpace"/>
-        <w:spacing w:after="60"/>
-      </w:pPr>
-    </w:p>
-    <w:p>
-      <w:pPr>
-        <w:pStyle w:val="MdHeading2"/>
-      </w:pPr>
-      <w:r>
-        <w:t>8. References</w:t>
-      </w:r>
-    </w:p>
-    <w:p>
-      <w:pPr>
-        <w:pStyle w:val="MdParagraph"/>
-      </w:pPr>
       <w:r>
         <w:t xml:space="preserve">Kingma, D. P., &amp; Ba, J. (2015). Adam: A method for stochastic optimization. </w:t>
       </w:r>
       <w:r>
         <w:rPr>
-          <w:rStyle w:val="MdEm"/>
+          <w:i/>
+          <w:iCs/>
         </w:rPr>
         <w:t>Proceedings of the 3rd International Conference on Learning Representations (ICLR 2015)</w:t>
       </w:r>
@@ -2329,21 +2399,15 @@
       <w:hyperlink r:id="rId10" w:history="1">
         <w:r>
           <w:rPr>
-            <w:rStyle w:val="MdLink"/>
+            <w:rStyle w:val="Hyperlink"/>
           </w:rPr>
           <w:t>https://arxiv.org/abs/1412.6980</w:t>
         </w:r>
       </w:hyperlink>
     </w:p>
+    <w:p/>
     <w:p>
       <w:pPr>
-        <w:pStyle w:val="MdSpace"/>
-        <w:spacing w:after="60"/>
-      </w:pPr>
-    </w:p>
-    <w:p>
-      <w:pPr>
-        <w:pStyle w:val="MdParagraph"/>
         <w:rPr>
           <w:lang w:val="fr-CA"/>
         </w:rPr>
@@ -2353,7 +2417,8 @@
       </w:r>
       <w:r>
         <w:rPr>
-          <w:rStyle w:val="MdEm"/>
+          <w:i/>
+          <w:iCs/>
         </w:rPr>
         <w:t>Proceedings of the 7th International Conference on Learning Representations (ICLR 2019)</w:t>
       </w:r>
@@ -2363,7 +2428,7 @@
       <w:hyperlink r:id="rId11" w:history="1">
         <w:r>
           <w:rPr>
-            <w:rStyle w:val="MdLink"/>
+            <w:rStyle w:val="Hyperlink"/>
             <w:lang w:val="fr-CA"/>
           </w:rPr>
           <w:t>https://arxiv.org/abs/1711.05101</w:t>
@@ -2372,17 +2437,12 @@
     </w:p>
     <w:p>
       <w:pPr>
-        <w:pStyle w:val="MdSpace"/>
-        <w:spacing w:after="60"/>
         <w:rPr>
           <w:lang w:val="fr-CA"/>
         </w:rPr>
       </w:pPr>
     </w:p>
     <w:p>
-      <w:pPr>
-        <w:pStyle w:val="MdParagraph"/>
-      </w:pPr>
       <w:r>
         <w:rPr>
           <w:lang w:val="fr-CA"/>
@@ -2405,7 +2465,8 @@
       </w:r>
       <w:r>
         <w:rPr>
-          <w:rStyle w:val="MdEm"/>
+          <w:i/>
+          <w:iCs/>
         </w:rPr>
         <w:t>COURSERA: Neural Networks for Machine Learning</w:t>
       </w:r>
@@ -2415,22 +2476,14 @@
       <w:hyperlink r:id="rId12" w:history="1">
         <w:r>
           <w:rPr>
-            <w:rStyle w:val="MdLink"/>
+            <w:rStyle w:val="Hyperlink"/>
           </w:rPr>
           <w:t>https://www.cs.toronto.edu/~tijmen/csc321/slides/lecture_slides_lec6.pdf</w:t>
         </w:r>
       </w:hyperlink>
     </w:p>
+    <w:p/>
     <w:p>
-      <w:pPr>
-        <w:pStyle w:val="MdSpace"/>
-        <w:spacing w:after="60"/>
-      </w:pPr>
-    </w:p>
-    <w:p>
-      <w:pPr>
-        <w:pStyle w:val="MdParagraph"/>
-      </w:pPr>
       <w:proofErr w:type="spellStart"/>
       <w:r>
         <w:rPr>
@@ -2479,14 +2532,16 @@
       <w:proofErr w:type="spellStart"/>
       <w:r>
         <w:rPr>
-          <w:rStyle w:val="MdEm"/>
+          <w:i/>
+          <w:iCs/>
         </w:rPr>
         <w:t>NeurIPS</w:t>
       </w:r>
       <w:proofErr w:type="spellEnd"/>
       <w:r>
         <w:rPr>
-          <w:rStyle w:val="MdEm"/>
+          <w:i/>
+          <w:iCs/>
         </w:rPr>
         <w:t xml:space="preserve"> 2018 Workshop on Machine Learning for Creativity and Design</w:t>
       </w:r>
@@ -2496,7 +2551,7 @@
       <w:hyperlink r:id="rId13" w:history="1">
         <w:r>
           <w:rPr>
-            <w:rStyle w:val="MdLink"/>
+            <w:rStyle w:val="Hyperlink"/>
           </w:rPr>
           <w:t>https://arxiv.org/abs/1812.01718</w:t>
         </w:r>
@@ -3252,7 +3307,6 @@
   <w:style w:type="character" w:default="1" w:styleId="Fontepargpadro">
     <w:name w:val="Default Paragraph Font"/>
     <w:uiPriority w:val="1"/>
-    <w:semiHidden/>
     <w:unhideWhenUsed/>
   </w:style>
   <w:style w:type="table" w:default="1" w:styleId="Tabelanormal">

</xml_diff>